<commit_message>
remake: SOC docs v0.1
</commit_message>
<xml_diff>
--- a/docs/secure_memory_soc_v0.1_guide.docx
+++ b/docs/secure_memory_soc_v0.1_guide.docx
@@ -10,7 +10,7 @@
       </w:pPr>
       <w:sdt>
         <w:sdtPr>
-          <w:id w:val="-1314230649"/>
+          <w:id w:val="493729251"/>
           <w:tag w:val="goog_rdk_0"/>
         </w:sdtPr>
         <w:sdtContent>
@@ -64,7 +64,7 @@
       </w:pPr>
       <w:sdt>
         <w:sdtPr>
-          <w:id w:val="1479384880"/>
+          <w:id w:val="1293793970"/>
           <w:tag w:val="goog_rdk_1"/>
         </w:sdtPr>
         <w:sdtContent>
@@ -141,7 +141,7 @@
             </w:pPr>
             <w:sdt>
               <w:sdtPr>
-                <w:id w:val="-2021074068"/>
+                <w:id w:val="1277202856"/>
                 <w:tag w:val="goog_rdk_2"/>
               </w:sdtPr>
               <w:sdtContent>
@@ -229,7 +229,7 @@
             </w:pPr>
             <w:sdt>
               <w:sdtPr>
-                <w:id w:val="1064708155"/>
+                <w:id w:val="836159173"/>
                 <w:tag w:val="goog_rdk_3"/>
               </w:sdtPr>
               <w:sdtContent>
@@ -317,7 +317,7 @@
             </w:pPr>
             <w:sdt>
               <w:sdtPr>
-                <w:id w:val="1569685375"/>
+                <w:id w:val="1329942830"/>
                 <w:tag w:val="goog_rdk_4"/>
               </w:sdtPr>
               <w:sdtContent>
@@ -405,7 +405,7 @@
             </w:pPr>
             <w:sdt>
               <w:sdtPr>
-                <w:id w:val="-874831149"/>
+                <w:id w:val="539093288"/>
                 <w:tag w:val="goog_rdk_5"/>
               </w:sdtPr>
               <w:sdtContent>
@@ -451,7 +451,7 @@
             </w:pPr>
             <w:sdt>
               <w:sdtPr>
-                <w:id w:val="-2042914813"/>
+                <w:id w:val="336303242"/>
                 <w:tag w:val="goog_rdk_6"/>
               </w:sdtPr>
               <w:sdtContent>
@@ -501,7 +501,7 @@
             </w:pPr>
             <w:sdt>
               <w:sdtPr>
-                <w:id w:val="-1670508097"/>
+                <w:id w:val="2017430583"/>
                 <w:tag w:val="goog_rdk_7"/>
               </w:sdtPr>
               <w:sdtContent>
@@ -598,6 +598,1889 @@
         </w:rPr>
       </w:r>
     </w:p>
+    <w:sdt>
+      <w:sdtPr>
+        <w:id w:val="-1824580254"/>
+        <w:docPartObj>
+          <w:docPartGallery w:val="Table of Contents"/>
+          <w:docPartUnique w:val="1"/>
+        </w:docPartObj>
+      </w:sdtPr>
+      <w:sdtContent>
+        <w:p>
+          <w:pPr>
+            <w:widowControl w:val="0"/>
+            <w:tabs>
+              <w:tab w:val="right" w:leader="dot" w:pos="9745.511811023624"/>
+            </w:tabs>
+            <w:spacing w:before="60" w:lineRule="auto"/>
+            <w:rPr>
+              <w:b w:val="1"/>
+              <w:bCs w:val="1"/>
+              <w:color w:val="000000"/>
+              <w:u w:val="none"/>
+            </w:rPr>
+          </w:pPr>
+          <w:r>
+            <w:fldChar w:fldCharType="begin"/>
+            <w:instrText xml:space="preserve"> TOC \h \u \z \t "Heading 1,1,Heading 2,2,Heading 3,3,Heading 4,4,Heading 5,5,Heading 6,6,"</w:instrText>
+            <w:fldChar w:fldCharType="separate"/>
+          </w:r>
+          <w:hyperlink w:anchor="_heading=">
+            <w:r>
+              <w:rPr>
+                <w:b w:val="1"/>
+                <w:bCs w:val="1"/>
+                <w:color w:val="000000"/>
+                <w:u w:val="none"/>
+                <w:rtl w:val="0"/>
+              </w:rPr>
+              <w:t xml:space="preserve">1. 프로젝트 개요</w:t>
+              <w:tab/>
+            </w:r>
+          </w:hyperlink>
+          <w:r>
+            <w:fldChar w:fldCharType="begin"/>
+            <w:instrText xml:space="preserve"> PAGEREF _heading= \h </w:instrText>
+            <w:fldChar w:fldCharType="separate"/>
+          </w:r>
+          <w:r>
+            <w:rPr>
+              <w:b w:val="1"/>
+              <w:bCs w:val="1"/>
+              <w:rtl w:val="0"/>
+            </w:rPr>
+            <w:t xml:space="preserve">2</w:t>
+          </w:r>
+          <w:r>
+            <w:fldChar w:fldCharType="end"/>
+          </w:r>
+          <w:r>
+            <w:rPr>
+              <w:rtl w:val="0"/>
+            </w:rPr>
+          </w:r>
+        </w:p>
+        <w:p>
+          <w:pPr>
+            <w:widowControl w:val="0"/>
+            <w:tabs>
+              <w:tab w:val="right" w:leader="dot" w:pos="9745.511811023624"/>
+            </w:tabs>
+            <w:spacing w:before="60" w:lineRule="auto"/>
+            <w:ind w:left="360" w:firstLine="0"/>
+            <w:rPr>
+              <w:color w:val="000000"/>
+              <w:u w:val="none"/>
+            </w:rPr>
+          </w:pPr>
+          <w:hyperlink w:anchor="_heading=">
+            <w:r>
+              <w:rPr>
+                <w:color w:val="000000"/>
+                <w:u w:val="none"/>
+                <w:rtl w:val="0"/>
+              </w:rPr>
+              <w:t xml:space="preserve">1.1 시스템 목표</w:t>
+              <w:tab/>
+            </w:r>
+          </w:hyperlink>
+          <w:r>
+            <w:fldChar w:fldCharType="begin"/>
+            <w:instrText xml:space="preserve"> PAGEREF _heading= \h </w:instrText>
+            <w:fldChar w:fldCharType="separate"/>
+          </w:r>
+          <w:r>
+            <w:rPr>
+              <w:rtl w:val="0"/>
+            </w:rPr>
+            <w:t xml:space="preserve">3</w:t>
+          </w:r>
+          <w:r>
+            <w:fldChar w:fldCharType="end"/>
+          </w:r>
+          <w:r>
+            <w:rPr>
+              <w:rtl w:val="0"/>
+            </w:rPr>
+          </w:r>
+        </w:p>
+        <w:p>
+          <w:pPr>
+            <w:widowControl w:val="0"/>
+            <w:tabs>
+              <w:tab w:val="right" w:leader="dot" w:pos="9745.511811023624"/>
+            </w:tabs>
+            <w:spacing w:before="60" w:lineRule="auto"/>
+            <w:ind w:left="360" w:firstLine="0"/>
+            <w:rPr>
+              <w:color w:val="000000"/>
+              <w:u w:val="none"/>
+            </w:rPr>
+          </w:pPr>
+          <w:hyperlink w:anchor="_heading=">
+            <w:r>
+              <w:rPr>
+                <w:color w:val="000000"/>
+                <w:u w:val="none"/>
+                <w:rtl w:val="0"/>
+              </w:rPr>
+              <w:t xml:space="preserve">1.2 보안 데이터 흐름</w:t>
+              <w:tab/>
+            </w:r>
+          </w:hyperlink>
+          <w:r>
+            <w:fldChar w:fldCharType="begin"/>
+            <w:instrText xml:space="preserve"> PAGEREF _heading= \h </w:instrText>
+            <w:fldChar w:fldCharType="separate"/>
+          </w:r>
+          <w:r>
+            <w:rPr>
+              <w:rtl w:val="0"/>
+            </w:rPr>
+            <w:t xml:space="preserve">3</w:t>
+          </w:r>
+          <w:r>
+            <w:fldChar w:fldCharType="end"/>
+          </w:r>
+          <w:r>
+            <w:rPr>
+              <w:rtl w:val="0"/>
+            </w:rPr>
+          </w:r>
+        </w:p>
+        <w:p>
+          <w:pPr>
+            <w:widowControl w:val="0"/>
+            <w:tabs>
+              <w:tab w:val="right" w:leader="dot" w:pos="9745.511811023624"/>
+            </w:tabs>
+            <w:spacing w:before="60" w:lineRule="auto"/>
+            <w:ind w:left="360" w:firstLine="0"/>
+            <w:rPr>
+              <w:color w:val="000000"/>
+              <w:u w:val="none"/>
+            </w:rPr>
+          </w:pPr>
+          <w:hyperlink w:anchor="_heading=">
+            <w:r>
+              <w:rPr>
+                <w:color w:val="000000"/>
+                <w:u w:val="none"/>
+                <w:rtl w:val="0"/>
+              </w:rPr>
+              <w:t xml:space="preserve">1.3 IP 구성 목록</w:t>
+              <w:tab/>
+            </w:r>
+          </w:hyperlink>
+          <w:r>
+            <w:fldChar w:fldCharType="begin"/>
+            <w:instrText xml:space="preserve"> PAGEREF _heading= \h </w:instrText>
+            <w:fldChar w:fldCharType="separate"/>
+          </w:r>
+          <w:r>
+            <w:rPr>
+              <w:rtl w:val="0"/>
+            </w:rPr>
+            <w:t xml:space="preserve">3</w:t>
+          </w:r>
+          <w:r>
+            <w:fldChar w:fldCharType="end"/>
+          </w:r>
+          <w:r>
+            <w:rPr>
+              <w:rtl w:val="0"/>
+            </w:rPr>
+          </w:r>
+        </w:p>
+        <w:p>
+          <w:pPr>
+            <w:widowControl w:val="0"/>
+            <w:tabs>
+              <w:tab w:val="right" w:leader="dot" w:pos="9745.511811023624"/>
+            </w:tabs>
+            <w:spacing w:before="60" w:lineRule="auto"/>
+            <w:rPr>
+              <w:b w:val="1"/>
+              <w:bCs w:val="1"/>
+              <w:color w:val="000000"/>
+              <w:u w:val="none"/>
+            </w:rPr>
+          </w:pPr>
+          <w:hyperlink w:anchor="_heading=">
+            <w:r>
+              <w:rPr>
+                <w:b w:val="1"/>
+                <w:bCs w:val="1"/>
+                <w:color w:val="000000"/>
+                <w:u w:val="none"/>
+                <w:rtl w:val="0"/>
+              </w:rPr>
+              <w:t xml:space="preserve">2. 개발 환경 및 사전 준비</w:t>
+              <w:tab/>
+            </w:r>
+          </w:hyperlink>
+          <w:r>
+            <w:fldChar w:fldCharType="begin"/>
+            <w:instrText xml:space="preserve"> PAGEREF _heading= \h </w:instrText>
+            <w:fldChar w:fldCharType="separate"/>
+          </w:r>
+          <w:r>
+            <w:rPr>
+              <w:b w:val="1"/>
+              <w:bCs w:val="1"/>
+              <w:rtl w:val="0"/>
+            </w:rPr>
+            <w:t xml:space="preserve">5</w:t>
+          </w:r>
+          <w:r>
+            <w:fldChar w:fldCharType="end"/>
+          </w:r>
+          <w:r>
+            <w:rPr>
+              <w:rtl w:val="0"/>
+            </w:rPr>
+          </w:r>
+        </w:p>
+        <w:p>
+          <w:pPr>
+            <w:widowControl w:val="0"/>
+            <w:tabs>
+              <w:tab w:val="right" w:leader="dot" w:pos="9745.511811023624"/>
+            </w:tabs>
+            <w:spacing w:before="60" w:lineRule="auto"/>
+            <w:ind w:left="360" w:firstLine="0"/>
+            <w:rPr>
+              <w:color w:val="000000"/>
+              <w:u w:val="none"/>
+            </w:rPr>
+          </w:pPr>
+          <w:hyperlink w:anchor="_heading=">
+            <w:r>
+              <w:rPr>
+                <w:color w:val="000000"/>
+                <w:u w:val="none"/>
+                <w:rtl w:val="0"/>
+              </w:rPr>
+              <w:t xml:space="preserve">2.1 하드웨어 사양</w:t>
+              <w:tab/>
+            </w:r>
+          </w:hyperlink>
+          <w:r>
+            <w:fldChar w:fldCharType="begin"/>
+            <w:instrText xml:space="preserve"> PAGEREF _heading= \h </w:instrText>
+            <w:fldChar w:fldCharType="separate"/>
+          </w:r>
+          <w:r>
+            <w:rPr>
+              <w:rtl w:val="0"/>
+            </w:rPr>
+            <w:t xml:space="preserve">5</w:t>
+          </w:r>
+          <w:r>
+            <w:fldChar w:fldCharType="end"/>
+          </w:r>
+          <w:r>
+            <w:rPr>
+              <w:rtl w:val="0"/>
+            </w:rPr>
+          </w:r>
+        </w:p>
+        <w:p>
+          <w:pPr>
+            <w:widowControl w:val="0"/>
+            <w:tabs>
+              <w:tab w:val="right" w:leader="dot" w:pos="9745.511811023624"/>
+            </w:tabs>
+            <w:spacing w:before="60" w:lineRule="auto"/>
+            <w:ind w:left="360" w:firstLine="0"/>
+            <w:rPr>
+              <w:color w:val="000000"/>
+              <w:u w:val="none"/>
+            </w:rPr>
+          </w:pPr>
+          <w:hyperlink w:anchor="_heading=">
+            <w:r>
+              <w:rPr>
+                <w:color w:val="000000"/>
+                <w:u w:val="none"/>
+                <w:rtl w:val="0"/>
+              </w:rPr>
+              <w:t xml:space="preserve">2.2 소프트웨어 환경</w:t>
+              <w:tab/>
+            </w:r>
+          </w:hyperlink>
+          <w:r>
+            <w:fldChar w:fldCharType="begin"/>
+            <w:instrText xml:space="preserve"> PAGEREF _heading= \h </w:instrText>
+            <w:fldChar w:fldCharType="separate"/>
+          </w:r>
+          <w:r>
+            <w:rPr>
+              <w:rtl w:val="0"/>
+            </w:rPr>
+            <w:t xml:space="preserve">5</w:t>
+          </w:r>
+          <w:r>
+            <w:fldChar w:fldCharType="end"/>
+          </w:r>
+          <w:r>
+            <w:rPr>
+              <w:rtl w:val="0"/>
+            </w:rPr>
+          </w:r>
+        </w:p>
+        <w:p>
+          <w:pPr>
+            <w:widowControl w:val="0"/>
+            <w:tabs>
+              <w:tab w:val="right" w:leader="dot" w:pos="9745.511811023624"/>
+            </w:tabs>
+            <w:spacing w:before="60" w:lineRule="auto"/>
+            <w:ind w:left="360" w:firstLine="0"/>
+            <w:rPr>
+              <w:color w:val="000000"/>
+              <w:u w:val="none"/>
+            </w:rPr>
+          </w:pPr>
+          <w:hyperlink w:anchor="_heading=">
+            <w:r>
+              <w:rPr>
+                <w:color w:val="000000"/>
+                <w:u w:val="none"/>
+                <w:rtl w:val="0"/>
+              </w:rPr>
+              <w:t xml:space="preserve">2.3 Basys3 vs Zynq 비교</w:t>
+              <w:tab/>
+            </w:r>
+          </w:hyperlink>
+          <w:r>
+            <w:fldChar w:fldCharType="begin"/>
+            <w:instrText xml:space="preserve"> PAGEREF _heading= \h </w:instrText>
+            <w:fldChar w:fldCharType="separate"/>
+          </w:r>
+          <w:r>
+            <w:rPr>
+              <w:rtl w:val="0"/>
+            </w:rPr>
+            <w:t xml:space="preserve">5</w:t>
+          </w:r>
+          <w:r>
+            <w:fldChar w:fldCharType="end"/>
+          </w:r>
+          <w:r>
+            <w:rPr>
+              <w:rtl w:val="0"/>
+            </w:rPr>
+          </w:r>
+        </w:p>
+        <w:p>
+          <w:pPr>
+            <w:widowControl w:val="0"/>
+            <w:tabs>
+              <w:tab w:val="right" w:leader="dot" w:pos="9745.511811023624"/>
+            </w:tabs>
+            <w:spacing w:before="60" w:lineRule="auto"/>
+            <w:rPr>
+              <w:b w:val="1"/>
+              <w:bCs w:val="1"/>
+              <w:color w:val="000000"/>
+              <w:u w:val="none"/>
+            </w:rPr>
+          </w:pPr>
+          <w:hyperlink w:anchor="_heading=">
+            <w:r>
+              <w:rPr>
+                <w:b w:val="1"/>
+                <w:bCs w:val="1"/>
+                <w:color w:val="000000"/>
+                <w:u w:val="none"/>
+                <w:rtl w:val="0"/>
+              </w:rPr>
+              <w:t xml:space="preserve">3. 커스텀 IP 설계</w:t>
+              <w:tab/>
+            </w:r>
+          </w:hyperlink>
+          <w:r>
+            <w:fldChar w:fldCharType="begin"/>
+            <w:instrText xml:space="preserve"> PAGEREF _heading= \h </w:instrText>
+            <w:fldChar w:fldCharType="separate"/>
+          </w:r>
+          <w:r>
+            <w:rPr>
+              <w:b w:val="1"/>
+              <w:bCs w:val="1"/>
+              <w:rtl w:val="0"/>
+            </w:rPr>
+            <w:t xml:space="preserve">6</w:t>
+          </w:r>
+          <w:r>
+            <w:fldChar w:fldCharType="end"/>
+          </w:r>
+          <w:r>
+            <w:rPr>
+              <w:rtl w:val="0"/>
+            </w:rPr>
+          </w:r>
+        </w:p>
+        <w:p>
+          <w:pPr>
+            <w:widowControl w:val="0"/>
+            <w:tabs>
+              <w:tab w:val="right" w:leader="dot" w:pos="9745.511811023624"/>
+            </w:tabs>
+            <w:spacing w:before="60" w:lineRule="auto"/>
+            <w:ind w:left="360" w:firstLine="0"/>
+            <w:rPr>
+              <w:color w:val="000000"/>
+              <w:u w:val="none"/>
+            </w:rPr>
+          </w:pPr>
+          <w:hyperlink w:anchor="_heading=">
+            <w:r>
+              <w:rPr>
+                <w:color w:val="000000"/>
+                <w:u w:val="none"/>
+                <w:rtl w:val="0"/>
+              </w:rPr>
+              <w:t xml:space="preserve">3.1 npu_axi_wrapper</w:t>
+              <w:tab/>
+            </w:r>
+          </w:hyperlink>
+          <w:r>
+            <w:fldChar w:fldCharType="begin"/>
+            <w:instrText xml:space="preserve"> PAGEREF _heading= \h </w:instrText>
+            <w:fldChar w:fldCharType="separate"/>
+          </w:r>
+          <w:r>
+            <w:rPr>
+              <w:rtl w:val="0"/>
+            </w:rPr>
+            <w:t xml:space="preserve">6</w:t>
+          </w:r>
+          <w:r>
+            <w:fldChar w:fldCharType="end"/>
+          </w:r>
+          <w:r>
+            <w:rPr>
+              <w:rtl w:val="0"/>
+            </w:rPr>
+          </w:r>
+        </w:p>
+        <w:p>
+          <w:pPr>
+            <w:widowControl w:val="0"/>
+            <w:tabs>
+              <w:tab w:val="right" w:leader="dot" w:pos="9745.511811023624"/>
+            </w:tabs>
+            <w:spacing w:before="60" w:lineRule="auto"/>
+            <w:ind w:left="360" w:firstLine="0"/>
+            <w:rPr>
+              <w:color w:val="000000"/>
+              <w:u w:val="none"/>
+            </w:rPr>
+          </w:pPr>
+          <w:hyperlink w:anchor="_heading=">
+            <w:r>
+              <w:rPr>
+                <w:color w:val="000000"/>
+                <w:u w:val="none"/>
+                <w:rtl w:val="0"/>
+              </w:rPr>
+              <w:t xml:space="preserve">3.2 aes_enc_axi_wrapper</w:t>
+              <w:tab/>
+            </w:r>
+          </w:hyperlink>
+          <w:r>
+            <w:fldChar w:fldCharType="begin"/>
+            <w:instrText xml:space="preserve"> PAGEREF _heading= \h </w:instrText>
+            <w:fldChar w:fldCharType="separate"/>
+          </w:r>
+          <w:r>
+            <w:rPr>
+              <w:rtl w:val="0"/>
+            </w:rPr>
+            <w:t xml:space="preserve">6</w:t>
+          </w:r>
+          <w:r>
+            <w:fldChar w:fldCharType="end"/>
+          </w:r>
+          <w:r>
+            <w:rPr>
+              <w:rtl w:val="0"/>
+            </w:rPr>
+          </w:r>
+        </w:p>
+        <w:p>
+          <w:pPr>
+            <w:widowControl w:val="0"/>
+            <w:tabs>
+              <w:tab w:val="right" w:leader="dot" w:pos="9745.511811023624"/>
+            </w:tabs>
+            <w:spacing w:before="60" w:lineRule="auto"/>
+            <w:ind w:left="360" w:firstLine="0"/>
+            <w:rPr>
+              <w:color w:val="000000"/>
+              <w:u w:val="none"/>
+            </w:rPr>
+          </w:pPr>
+          <w:hyperlink w:anchor="_heading=">
+            <w:r>
+              <w:rPr>
+                <w:color w:val="000000"/>
+                <w:u w:val="none"/>
+                <w:rtl w:val="0"/>
+              </w:rPr>
+              <w:t xml:space="preserve">3.3 aes_dec_axi_wrapper</w:t>
+              <w:tab/>
+            </w:r>
+          </w:hyperlink>
+          <w:r>
+            <w:fldChar w:fldCharType="begin"/>
+            <w:instrText xml:space="preserve"> PAGEREF _heading= \h </w:instrText>
+            <w:fldChar w:fldCharType="separate"/>
+          </w:r>
+          <w:r>
+            <w:rPr>
+              <w:rtl w:val="0"/>
+            </w:rPr>
+            <w:t xml:space="preserve">6</w:t>
+          </w:r>
+          <w:r>
+            <w:fldChar w:fldCharType="end"/>
+          </w:r>
+          <w:r>
+            <w:rPr>
+              <w:rtl w:val="0"/>
+            </w:rPr>
+          </w:r>
+        </w:p>
+        <w:p>
+          <w:pPr>
+            <w:widowControl w:val="0"/>
+            <w:tabs>
+              <w:tab w:val="right" w:leader="dot" w:pos="9745.511811023624"/>
+            </w:tabs>
+            <w:spacing w:before="60" w:lineRule="auto"/>
+            <w:ind w:left="360" w:firstLine="0"/>
+            <w:rPr>
+              <w:color w:val="000000"/>
+              <w:u w:val="none"/>
+            </w:rPr>
+          </w:pPr>
+          <w:hyperlink w:anchor="_heading=">
+            <w:r>
+              <w:rPr>
+                <w:color w:val="000000"/>
+                <w:u w:val="none"/>
+                <w:rtl w:val="0"/>
+              </w:rPr>
+              <w:t xml:space="preserve">3.4 top_dma_full_to_stream</w:t>
+              <w:tab/>
+            </w:r>
+          </w:hyperlink>
+          <w:r>
+            <w:fldChar w:fldCharType="begin"/>
+            <w:instrText xml:space="preserve"> PAGEREF _heading= \h </w:instrText>
+            <w:fldChar w:fldCharType="separate"/>
+          </w:r>
+          <w:r>
+            <w:rPr>
+              <w:rtl w:val="0"/>
+            </w:rPr>
+            <w:t xml:space="preserve">6</w:t>
+          </w:r>
+          <w:r>
+            <w:fldChar w:fldCharType="end"/>
+          </w:r>
+          <w:r>
+            <w:rPr>
+              <w:rtl w:val="0"/>
+            </w:rPr>
+          </w:r>
+        </w:p>
+        <w:p>
+          <w:pPr>
+            <w:widowControl w:val="0"/>
+            <w:tabs>
+              <w:tab w:val="right" w:leader="dot" w:pos="9745.511811023624"/>
+            </w:tabs>
+            <w:spacing w:before="60" w:lineRule="auto"/>
+            <w:ind w:left="360" w:firstLine="0"/>
+            <w:rPr>
+              <w:color w:val="000000"/>
+              <w:u w:val="none"/>
+            </w:rPr>
+          </w:pPr>
+          <w:hyperlink w:anchor="_heading=">
+            <w:r>
+              <w:rPr>
+                <w:color w:val="000000"/>
+                <w:u w:val="none"/>
+                <w:rtl w:val="0"/>
+              </w:rPr>
+              <w:t xml:space="preserve">3.5 top_dma_stream_to_full</w:t>
+              <w:tab/>
+            </w:r>
+          </w:hyperlink>
+          <w:r>
+            <w:fldChar w:fldCharType="begin"/>
+            <w:instrText xml:space="preserve"> PAGEREF _heading= \h </w:instrText>
+            <w:fldChar w:fldCharType="separate"/>
+          </w:r>
+          <w:r>
+            <w:rPr>
+              <w:rtl w:val="0"/>
+            </w:rPr>
+            <w:t xml:space="preserve">7</w:t>
+          </w:r>
+          <w:r>
+            <w:fldChar w:fldCharType="end"/>
+          </w:r>
+          <w:r>
+            <w:rPr>
+              <w:rtl w:val="0"/>
+            </w:rPr>
+          </w:r>
+        </w:p>
+        <w:p>
+          <w:pPr>
+            <w:widowControl w:val="0"/>
+            <w:tabs>
+              <w:tab w:val="right" w:leader="dot" w:pos="9745.511811023624"/>
+            </w:tabs>
+            <w:spacing w:before="60" w:lineRule="auto"/>
+            <w:rPr>
+              <w:b w:val="1"/>
+              <w:bCs w:val="1"/>
+              <w:color w:val="000000"/>
+              <w:u w:val="none"/>
+            </w:rPr>
+          </w:pPr>
+          <w:hyperlink w:anchor="_heading=">
+            <w:r>
+              <w:rPr>
+                <w:b w:val="1"/>
+                <w:bCs w:val="1"/>
+                <w:color w:val="000000"/>
+                <w:u w:val="none"/>
+                <w:rtl w:val="0"/>
+              </w:rPr>
+              <w:t xml:space="preserve">4. Block Design 구현</w:t>
+              <w:tab/>
+            </w:r>
+          </w:hyperlink>
+          <w:r>
+            <w:fldChar w:fldCharType="begin"/>
+            <w:instrText xml:space="preserve"> PAGEREF _heading= \h </w:instrText>
+            <w:fldChar w:fldCharType="separate"/>
+          </w:r>
+          <w:r>
+            <w:rPr>
+              <w:b w:val="1"/>
+              <w:bCs w:val="1"/>
+              <w:rtl w:val="0"/>
+            </w:rPr>
+            <w:t xml:space="preserve">8</w:t>
+          </w:r>
+          <w:r>
+            <w:fldChar w:fldCharType="end"/>
+          </w:r>
+          <w:r>
+            <w:rPr>
+              <w:rtl w:val="0"/>
+            </w:rPr>
+          </w:r>
+        </w:p>
+        <w:p>
+          <w:pPr>
+            <w:widowControl w:val="0"/>
+            <w:tabs>
+              <w:tab w:val="right" w:leader="dot" w:pos="9745.511811023624"/>
+            </w:tabs>
+            <w:spacing w:before="60" w:lineRule="auto"/>
+            <w:ind w:left="360" w:firstLine="0"/>
+            <w:rPr>
+              <w:color w:val="000000"/>
+              <w:u w:val="none"/>
+            </w:rPr>
+          </w:pPr>
+          <w:hyperlink w:anchor="_heading=">
+            <w:r>
+              <w:rPr>
+                <w:color w:val="000000"/>
+                <w:u w:val="none"/>
+                <w:rtl w:val="0"/>
+              </w:rPr>
+              <w:t xml:space="preserve">4.1 전체 아키텍처</w:t>
+              <w:tab/>
+            </w:r>
+          </w:hyperlink>
+          <w:r>
+            <w:fldChar w:fldCharType="begin"/>
+            <w:instrText xml:space="preserve"> PAGEREF _heading= \h </w:instrText>
+            <w:fldChar w:fldCharType="separate"/>
+          </w:r>
+          <w:r>
+            <w:rPr>
+              <w:rtl w:val="0"/>
+            </w:rPr>
+            <w:t xml:space="preserve">8</w:t>
+          </w:r>
+          <w:r>
+            <w:fldChar w:fldCharType="end"/>
+          </w:r>
+          <w:r>
+            <w:rPr>
+              <w:rtl w:val="0"/>
+            </w:rPr>
+          </w:r>
+        </w:p>
+        <w:p>
+          <w:pPr>
+            <w:widowControl w:val="0"/>
+            <w:tabs>
+              <w:tab w:val="right" w:leader="dot" w:pos="9745.511811023624"/>
+            </w:tabs>
+            <w:spacing w:before="60" w:lineRule="auto"/>
+            <w:ind w:left="360" w:firstLine="0"/>
+            <w:rPr>
+              <w:color w:val="000000"/>
+              <w:u w:val="none"/>
+            </w:rPr>
+          </w:pPr>
+          <w:hyperlink w:anchor="_heading=">
+            <w:r>
+              <w:rPr>
+                <w:color w:val="000000"/>
+                <w:u w:val="none"/>
+                <w:rtl w:val="0"/>
+              </w:rPr>
+              <w:t xml:space="preserve">4.2 ZYNQ7 PS 설정</w:t>
+              <w:tab/>
+            </w:r>
+          </w:hyperlink>
+          <w:r>
+            <w:fldChar w:fldCharType="begin"/>
+            <w:instrText xml:space="preserve"> PAGEREF _heading= \h </w:instrText>
+            <w:fldChar w:fldCharType="separate"/>
+          </w:r>
+          <w:r>
+            <w:rPr>
+              <w:rtl w:val="0"/>
+            </w:rPr>
+            <w:t xml:space="preserve">8</w:t>
+          </w:r>
+          <w:r>
+            <w:fldChar w:fldCharType="end"/>
+          </w:r>
+          <w:r>
+            <w:rPr>
+              <w:rtl w:val="0"/>
+            </w:rPr>
+          </w:r>
+        </w:p>
+        <w:p>
+          <w:pPr>
+            <w:widowControl w:val="0"/>
+            <w:tabs>
+              <w:tab w:val="right" w:leader="dot" w:pos="9745.511811023624"/>
+            </w:tabs>
+            <w:spacing w:before="60" w:lineRule="auto"/>
+            <w:ind w:left="720" w:firstLine="0"/>
+            <w:rPr>
+              <w:color w:val="000000"/>
+              <w:u w:val="none"/>
+            </w:rPr>
+          </w:pPr>
+          <w:hyperlink w:anchor="_heading=">
+            <w:r>
+              <w:rPr>
+                <w:color w:val="000000"/>
+                <w:u w:val="none"/>
+                <w:rtl w:val="0"/>
+              </w:rPr>
+              <w:t xml:space="preserve">4.2.1 기본 설정</w:t>
+              <w:tab/>
+            </w:r>
+          </w:hyperlink>
+          <w:r>
+            <w:fldChar w:fldCharType="begin"/>
+            <w:instrText xml:space="preserve"> PAGEREF _heading= \h </w:instrText>
+            <w:fldChar w:fldCharType="separate"/>
+          </w:r>
+          <w:r>
+            <w:rPr>
+              <w:rtl w:val="0"/>
+            </w:rPr>
+            <w:t xml:space="preserve">8</w:t>
+          </w:r>
+          <w:r>
+            <w:fldChar w:fldCharType="end"/>
+          </w:r>
+          <w:r>
+            <w:rPr>
+              <w:rtl w:val="0"/>
+            </w:rPr>
+          </w:r>
+        </w:p>
+        <w:p>
+          <w:pPr>
+            <w:widowControl w:val="0"/>
+            <w:tabs>
+              <w:tab w:val="right" w:leader="dot" w:pos="9745.511811023624"/>
+            </w:tabs>
+            <w:spacing w:before="60" w:lineRule="auto"/>
+            <w:ind w:left="360" w:firstLine="0"/>
+            <w:rPr>
+              <w:color w:val="000000"/>
+              <w:u w:val="none"/>
+            </w:rPr>
+          </w:pPr>
+          <w:hyperlink w:anchor="_heading=">
+            <w:r>
+              <w:rPr>
+                <w:color w:val="000000"/>
+                <w:u w:val="none"/>
+                <w:rtl w:val="0"/>
+              </w:rPr>
+              <w:t xml:space="preserve">4.3 커스텀 IP 패키징</w:t>
+              <w:tab/>
+            </w:r>
+          </w:hyperlink>
+          <w:r>
+            <w:fldChar w:fldCharType="begin"/>
+            <w:instrText xml:space="preserve"> PAGEREF _heading= \h </w:instrText>
+            <w:fldChar w:fldCharType="separate"/>
+          </w:r>
+          <w:r>
+            <w:rPr>
+              <w:rtl w:val="0"/>
+            </w:rPr>
+            <w:t xml:space="preserve">8</w:t>
+          </w:r>
+          <w:r>
+            <w:fldChar w:fldCharType="end"/>
+          </w:r>
+          <w:r>
+            <w:rPr>
+              <w:rtl w:val="0"/>
+            </w:rPr>
+          </w:r>
+        </w:p>
+        <w:p>
+          <w:pPr>
+            <w:widowControl w:val="0"/>
+            <w:tabs>
+              <w:tab w:val="right" w:leader="dot" w:pos="9745.511811023624"/>
+            </w:tabs>
+            <w:spacing w:before="60" w:lineRule="auto"/>
+            <w:ind w:left="360" w:firstLine="0"/>
+            <w:rPr>
+              <w:color w:val="000000"/>
+              <w:u w:val="none"/>
+            </w:rPr>
+          </w:pPr>
+          <w:hyperlink w:anchor="_heading=">
+            <w:r>
+              <w:rPr>
+                <w:color w:val="000000"/>
+                <w:u w:val="none"/>
+                <w:rtl w:val="0"/>
+              </w:rPr>
+              <w:t xml:space="preserve">4.4 IP 연결 구성</w:t>
+              <w:tab/>
+            </w:r>
+          </w:hyperlink>
+          <w:r>
+            <w:fldChar w:fldCharType="begin"/>
+            <w:instrText xml:space="preserve"> PAGEREF _heading= \h </w:instrText>
+            <w:fldChar w:fldCharType="separate"/>
+          </w:r>
+          <w:r>
+            <w:rPr>
+              <w:rtl w:val="0"/>
+            </w:rPr>
+            <w:t xml:space="preserve">9</w:t>
+          </w:r>
+          <w:r>
+            <w:fldChar w:fldCharType="end"/>
+          </w:r>
+          <w:r>
+            <w:rPr>
+              <w:rtl w:val="0"/>
+            </w:rPr>
+          </w:r>
+        </w:p>
+        <w:p>
+          <w:pPr>
+            <w:widowControl w:val="0"/>
+            <w:tabs>
+              <w:tab w:val="right" w:leader="dot" w:pos="9745.511811023624"/>
+            </w:tabs>
+            <w:spacing w:before="60" w:lineRule="auto"/>
+            <w:ind w:left="720" w:firstLine="0"/>
+            <w:rPr>
+              <w:color w:val="000000"/>
+              <w:u w:val="none"/>
+            </w:rPr>
+          </w:pPr>
+          <w:hyperlink w:anchor="_heading=">
+            <w:r>
+              <w:rPr>
+                <w:color w:val="000000"/>
+                <w:u w:val="none"/>
+                <w:rtl w:val="0"/>
+              </w:rPr>
+              <w:t xml:space="preserve">4.4.1 클럭 및 리셋</w:t>
+              <w:tab/>
+            </w:r>
+          </w:hyperlink>
+          <w:r>
+            <w:fldChar w:fldCharType="begin"/>
+            <w:instrText xml:space="preserve"> PAGEREF _heading= \h </w:instrText>
+            <w:fldChar w:fldCharType="separate"/>
+          </w:r>
+          <w:r>
+            <w:rPr>
+              <w:rtl w:val="0"/>
+            </w:rPr>
+            <w:t xml:space="preserve">9</w:t>
+          </w:r>
+          <w:r>
+            <w:fldChar w:fldCharType="end"/>
+          </w:r>
+          <w:r>
+            <w:rPr>
+              <w:rtl w:val="0"/>
+            </w:rPr>
+          </w:r>
+        </w:p>
+        <w:p>
+          <w:pPr>
+            <w:widowControl w:val="0"/>
+            <w:tabs>
+              <w:tab w:val="right" w:leader="dot" w:pos="9745.511811023624"/>
+            </w:tabs>
+            <w:spacing w:before="60" w:lineRule="auto"/>
+            <w:ind w:left="720" w:firstLine="0"/>
+            <w:rPr>
+              <w:color w:val="000000"/>
+              <w:u w:val="none"/>
+            </w:rPr>
+          </w:pPr>
+          <w:hyperlink w:anchor="_heading=">
+            <w:r>
+              <w:rPr>
+                <w:color w:val="000000"/>
+                <w:u w:val="none"/>
+                <w:rtl w:val="0"/>
+              </w:rPr>
+              <w:t xml:space="preserve">4.4.2 AXI-Lite 제어 버스</w:t>
+              <w:tab/>
+            </w:r>
+          </w:hyperlink>
+          <w:r>
+            <w:fldChar w:fldCharType="begin"/>
+            <w:instrText xml:space="preserve"> PAGEREF _heading= \h </w:instrText>
+            <w:fldChar w:fldCharType="separate"/>
+          </w:r>
+          <w:r>
+            <w:rPr>
+              <w:rtl w:val="0"/>
+            </w:rPr>
+            <w:t xml:space="preserve">9</w:t>
+          </w:r>
+          <w:r>
+            <w:fldChar w:fldCharType="end"/>
+          </w:r>
+          <w:r>
+            <w:rPr>
+              <w:rtl w:val="0"/>
+            </w:rPr>
+          </w:r>
+        </w:p>
+        <w:p>
+          <w:pPr>
+            <w:widowControl w:val="0"/>
+            <w:tabs>
+              <w:tab w:val="right" w:leader="dot" w:pos="9745.511811023624"/>
+            </w:tabs>
+            <w:spacing w:before="60" w:lineRule="auto"/>
+            <w:ind w:left="720" w:firstLine="0"/>
+            <w:rPr>
+              <w:color w:val="000000"/>
+              <w:u w:val="none"/>
+            </w:rPr>
+          </w:pPr>
+          <w:hyperlink w:anchor="_heading=">
+            <w:r>
+              <w:rPr>
+                <w:color w:val="000000"/>
+                <w:u w:val="none"/>
+                <w:rtl w:val="0"/>
+              </w:rPr>
+              <w:t xml:space="preserve">4.4.3 AXI-Full 메모리 버스</w:t>
+              <w:tab/>
+            </w:r>
+          </w:hyperlink>
+          <w:r>
+            <w:fldChar w:fldCharType="begin"/>
+            <w:instrText xml:space="preserve"> PAGEREF _heading= \h </w:instrText>
+            <w:fldChar w:fldCharType="separate"/>
+          </w:r>
+          <w:r>
+            <w:rPr>
+              <w:rtl w:val="0"/>
+            </w:rPr>
+            <w:t xml:space="preserve">9</w:t>
+          </w:r>
+          <w:r>
+            <w:fldChar w:fldCharType="end"/>
+          </w:r>
+          <w:r>
+            <w:rPr>
+              <w:rtl w:val="0"/>
+            </w:rPr>
+          </w:r>
+        </w:p>
+        <w:p>
+          <w:pPr>
+            <w:widowControl w:val="0"/>
+            <w:tabs>
+              <w:tab w:val="right" w:leader="dot" w:pos="9745.511811023624"/>
+            </w:tabs>
+            <w:spacing w:before="60" w:lineRule="auto"/>
+            <w:ind w:left="720" w:firstLine="0"/>
+            <w:rPr>
+              <w:color w:val="000000"/>
+              <w:u w:val="none"/>
+            </w:rPr>
+          </w:pPr>
+          <w:hyperlink w:anchor="_heading=">
+            <w:r>
+              <w:rPr>
+                <w:color w:val="000000"/>
+                <w:u w:val="none"/>
+                <w:rtl w:val="0"/>
+              </w:rPr>
+              <w:t xml:space="preserve">4.4.4 AXI4-Stream 데이터 체인</w:t>
+              <w:tab/>
+            </w:r>
+          </w:hyperlink>
+          <w:r>
+            <w:fldChar w:fldCharType="begin"/>
+            <w:instrText xml:space="preserve"> PAGEREF _heading= \h </w:instrText>
+            <w:fldChar w:fldCharType="separate"/>
+          </w:r>
+          <w:r>
+            <w:rPr>
+              <w:rtl w:val="0"/>
+            </w:rPr>
+            <w:t xml:space="preserve">9</w:t>
+          </w:r>
+          <w:r>
+            <w:fldChar w:fldCharType="end"/>
+          </w:r>
+          <w:r>
+            <w:rPr>
+              <w:rtl w:val="0"/>
+            </w:rPr>
+          </w:r>
+        </w:p>
+        <w:p>
+          <w:pPr>
+            <w:widowControl w:val="0"/>
+            <w:tabs>
+              <w:tab w:val="right" w:leader="dot" w:pos="9745.511811023624"/>
+            </w:tabs>
+            <w:spacing w:before="60" w:lineRule="auto"/>
+            <w:ind w:left="720" w:firstLine="0"/>
+            <w:rPr>
+              <w:color w:val="000000"/>
+              <w:u w:val="none"/>
+            </w:rPr>
+          </w:pPr>
+          <w:hyperlink w:anchor="_heading=">
+            <w:r>
+              <w:rPr>
+                <w:color w:val="000000"/>
+                <w:u w:val="none"/>
+                <w:rtl w:val="0"/>
+              </w:rPr>
+              <w:t xml:space="preserve">4.4.5 인터럽트 연결</w:t>
+              <w:tab/>
+            </w:r>
+          </w:hyperlink>
+          <w:r>
+            <w:fldChar w:fldCharType="begin"/>
+            <w:instrText xml:space="preserve"> PAGEREF _heading= \h </w:instrText>
+            <w:fldChar w:fldCharType="separate"/>
+          </w:r>
+          <w:r>
+            <w:rPr>
+              <w:rtl w:val="0"/>
+            </w:rPr>
+            <w:t xml:space="preserve">10</w:t>
+          </w:r>
+          <w:r>
+            <w:fldChar w:fldCharType="end"/>
+          </w:r>
+          <w:r>
+            <w:rPr>
+              <w:rtl w:val="0"/>
+            </w:rPr>
+          </w:r>
+        </w:p>
+        <w:p>
+          <w:pPr>
+            <w:widowControl w:val="0"/>
+            <w:tabs>
+              <w:tab w:val="right" w:leader="dot" w:pos="9745.511811023624"/>
+            </w:tabs>
+            <w:spacing w:before="60" w:lineRule="auto"/>
+            <w:ind w:left="360" w:firstLine="0"/>
+            <w:rPr>
+              <w:color w:val="000000"/>
+              <w:u w:val="none"/>
+            </w:rPr>
+          </w:pPr>
+          <w:hyperlink w:anchor="_heading=">
+            <w:r>
+              <w:rPr>
+                <w:color w:val="000000"/>
+                <w:u w:val="none"/>
+                <w:rtl w:val="0"/>
+              </w:rPr>
+              <w:t xml:space="preserve">4.5 완성된 Block Design</w:t>
+              <w:tab/>
+            </w:r>
+          </w:hyperlink>
+          <w:r>
+            <w:fldChar w:fldCharType="begin"/>
+            <w:instrText xml:space="preserve"> PAGEREF _heading= \h </w:instrText>
+            <w:fldChar w:fldCharType="separate"/>
+          </w:r>
+          <w:r>
+            <w:rPr>
+              <w:rtl w:val="0"/>
+            </w:rPr>
+            <w:t xml:space="preserve">10</w:t>
+          </w:r>
+          <w:r>
+            <w:fldChar w:fldCharType="end"/>
+          </w:r>
+          <w:r>
+            <w:rPr>
+              <w:rtl w:val="0"/>
+            </w:rPr>
+          </w:r>
+        </w:p>
+        <w:p>
+          <w:pPr>
+            <w:widowControl w:val="0"/>
+            <w:tabs>
+              <w:tab w:val="right" w:leader="dot" w:pos="9745.511811023624"/>
+            </w:tabs>
+            <w:spacing w:before="60" w:lineRule="auto"/>
+            <w:rPr>
+              <w:b w:val="1"/>
+              <w:bCs w:val="1"/>
+              <w:color w:val="000000"/>
+              <w:u w:val="none"/>
+            </w:rPr>
+          </w:pPr>
+          <w:hyperlink w:anchor="_heading=">
+            <w:r>
+              <w:rPr>
+                <w:b w:val="1"/>
+                <w:bCs w:val="1"/>
+                <w:color w:val="000000"/>
+                <w:u w:val="none"/>
+                <w:rtl w:val="0"/>
+              </w:rPr>
+              <w:t xml:space="preserve">5. 주소 맵 (Address Map)</w:t>
+              <w:tab/>
+            </w:r>
+          </w:hyperlink>
+          <w:r>
+            <w:fldChar w:fldCharType="begin"/>
+            <w:instrText xml:space="preserve"> PAGEREF _heading= \h </w:instrText>
+            <w:fldChar w:fldCharType="separate"/>
+          </w:r>
+          <w:r>
+            <w:rPr>
+              <w:b w:val="1"/>
+              <w:bCs w:val="1"/>
+              <w:rtl w:val="0"/>
+            </w:rPr>
+            <w:t xml:space="preserve">11</w:t>
+          </w:r>
+          <w:r>
+            <w:fldChar w:fldCharType="end"/>
+          </w:r>
+          <w:r>
+            <w:rPr>
+              <w:rtl w:val="0"/>
+            </w:rPr>
+          </w:r>
+        </w:p>
+        <w:p>
+          <w:pPr>
+            <w:widowControl w:val="0"/>
+            <w:tabs>
+              <w:tab w:val="right" w:leader="dot" w:pos="9745.511811023624"/>
+            </w:tabs>
+            <w:spacing w:before="60" w:lineRule="auto"/>
+            <w:ind w:left="360" w:firstLine="0"/>
+            <w:rPr>
+              <w:color w:val="000000"/>
+              <w:u w:val="none"/>
+            </w:rPr>
+          </w:pPr>
+          <w:hyperlink w:anchor="_heading=">
+            <w:r>
+              <w:rPr>
+                <w:color w:val="000000"/>
+                <w:u w:val="none"/>
+                <w:rtl w:val="0"/>
+              </w:rPr>
+              <w:t xml:space="preserve">5.1 DMA 레지스터 맵</w:t>
+              <w:tab/>
+            </w:r>
+          </w:hyperlink>
+          <w:r>
+            <w:fldChar w:fldCharType="begin"/>
+            <w:instrText xml:space="preserve"> PAGEREF _heading= \h </w:instrText>
+            <w:fldChar w:fldCharType="separate"/>
+          </w:r>
+          <w:r>
+            <w:rPr>
+              <w:rtl w:val="0"/>
+            </w:rPr>
+            <w:t xml:space="preserve">11</w:t>
+          </w:r>
+          <w:r>
+            <w:fldChar w:fldCharType="end"/>
+          </w:r>
+          <w:r>
+            <w:rPr>
+              <w:rtl w:val="0"/>
+            </w:rPr>
+          </w:r>
+        </w:p>
+        <w:p>
+          <w:pPr>
+            <w:widowControl w:val="0"/>
+            <w:tabs>
+              <w:tab w:val="right" w:leader="dot" w:pos="9745.511811023624"/>
+            </w:tabs>
+            <w:spacing w:before="60" w:lineRule="auto"/>
+            <w:rPr>
+              <w:b w:val="1"/>
+              <w:bCs w:val="1"/>
+              <w:color w:val="000000"/>
+              <w:u w:val="none"/>
+            </w:rPr>
+          </w:pPr>
+          <w:hyperlink w:anchor="_heading=">
+            <w:r>
+              <w:rPr>
+                <w:b w:val="1"/>
+                <w:bCs w:val="1"/>
+                <w:color w:val="000000"/>
+                <w:u w:val="none"/>
+                <w:rtl w:val="0"/>
+              </w:rPr>
+              <w:t xml:space="preserve">6. XDC 핀 배정</w:t>
+              <w:tab/>
+            </w:r>
+          </w:hyperlink>
+          <w:r>
+            <w:fldChar w:fldCharType="begin"/>
+            <w:instrText xml:space="preserve"> PAGEREF _heading= \h </w:instrText>
+            <w:fldChar w:fldCharType="separate"/>
+          </w:r>
+          <w:r>
+            <w:rPr>
+              <w:b w:val="1"/>
+              <w:bCs w:val="1"/>
+              <w:rtl w:val="0"/>
+            </w:rPr>
+            <w:t xml:space="preserve">12</w:t>
+          </w:r>
+          <w:r>
+            <w:fldChar w:fldCharType="end"/>
+          </w:r>
+          <w:r>
+            <w:rPr>
+              <w:rtl w:val="0"/>
+            </w:rPr>
+          </w:r>
+        </w:p>
+        <w:p>
+          <w:pPr>
+            <w:widowControl w:val="0"/>
+            <w:tabs>
+              <w:tab w:val="right" w:leader="dot" w:pos="9745.511811023624"/>
+            </w:tabs>
+            <w:spacing w:before="60" w:lineRule="auto"/>
+            <w:ind w:left="360" w:firstLine="0"/>
+            <w:rPr>
+              <w:color w:val="000000"/>
+              <w:u w:val="none"/>
+            </w:rPr>
+          </w:pPr>
+          <w:hyperlink w:anchor="_heading=">
+            <w:r>
+              <w:rPr>
+                <w:color w:val="000000"/>
+                <w:u w:val="none"/>
+                <w:rtl w:val="0"/>
+              </w:rPr>
+              <w:t xml:space="preserve">6.1 핀 배정 기본 원칙</w:t>
+              <w:tab/>
+            </w:r>
+          </w:hyperlink>
+          <w:r>
+            <w:fldChar w:fldCharType="begin"/>
+            <w:instrText xml:space="preserve"> PAGEREF _heading= \h </w:instrText>
+            <w:fldChar w:fldCharType="separate"/>
+          </w:r>
+          <w:r>
+            <w:rPr>
+              <w:rtl w:val="0"/>
+            </w:rPr>
+            <w:t xml:space="preserve">12</w:t>
+          </w:r>
+          <w:r>
+            <w:fldChar w:fldCharType="end"/>
+          </w:r>
+          <w:r>
+            <w:rPr>
+              <w:rtl w:val="0"/>
+            </w:rPr>
+          </w:r>
+        </w:p>
+        <w:p>
+          <w:pPr>
+            <w:widowControl w:val="0"/>
+            <w:tabs>
+              <w:tab w:val="right" w:leader="dot" w:pos="9745.511811023624"/>
+            </w:tabs>
+            <w:spacing w:before="60" w:lineRule="auto"/>
+            <w:ind w:left="360" w:firstLine="0"/>
+            <w:rPr>
+              <w:color w:val="000000"/>
+              <w:u w:val="none"/>
+            </w:rPr>
+          </w:pPr>
+          <w:hyperlink w:anchor="_heading=">
+            <w:r>
+              <w:rPr>
+                <w:color w:val="000000"/>
+                <w:u w:val="none"/>
+                <w:rtl w:val="0"/>
+              </w:rPr>
+              <w:t xml:space="preserve">6.2 FND 출력 핀 배정</w:t>
+              <w:tab/>
+            </w:r>
+          </w:hyperlink>
+          <w:r>
+            <w:fldChar w:fldCharType="begin"/>
+            <w:instrText xml:space="preserve"> PAGEREF _heading= \h </w:instrText>
+            <w:fldChar w:fldCharType="separate"/>
+          </w:r>
+          <w:r>
+            <w:rPr>
+              <w:rtl w:val="0"/>
+            </w:rPr>
+            <w:t xml:space="preserve">12</w:t>
+          </w:r>
+          <w:r>
+            <w:fldChar w:fldCharType="end"/>
+          </w:r>
+          <w:r>
+            <w:rPr>
+              <w:rtl w:val="0"/>
+            </w:rPr>
+          </w:r>
+        </w:p>
+        <w:p>
+          <w:pPr>
+            <w:widowControl w:val="0"/>
+            <w:tabs>
+              <w:tab w:val="right" w:leader="dot" w:pos="9745.511811023624"/>
+            </w:tabs>
+            <w:spacing w:before="60" w:lineRule="auto"/>
+            <w:rPr>
+              <w:b w:val="1"/>
+              <w:bCs w:val="1"/>
+              <w:color w:val="000000"/>
+              <w:u w:val="none"/>
+            </w:rPr>
+          </w:pPr>
+          <w:hyperlink w:anchor="_heading=">
+            <w:r>
+              <w:rPr>
+                <w:b w:val="1"/>
+                <w:bCs w:val="1"/>
+                <w:color w:val="000000"/>
+                <w:u w:val="none"/>
+                <w:rtl w:val="0"/>
+              </w:rPr>
+              <w:t xml:space="preserve">7. 빌드 및 검증</w:t>
+              <w:tab/>
+            </w:r>
+          </w:hyperlink>
+          <w:r>
+            <w:fldChar w:fldCharType="begin"/>
+            <w:instrText xml:space="preserve"> PAGEREF _heading= \h </w:instrText>
+            <w:fldChar w:fldCharType="separate"/>
+          </w:r>
+          <w:r>
+            <w:rPr>
+              <w:b w:val="1"/>
+              <w:bCs w:val="1"/>
+              <w:rtl w:val="0"/>
+            </w:rPr>
+            <w:t xml:space="preserve">13</w:t>
+          </w:r>
+          <w:r>
+            <w:fldChar w:fldCharType="end"/>
+          </w:r>
+          <w:r>
+            <w:rPr>
+              <w:rtl w:val="0"/>
+            </w:rPr>
+          </w:r>
+        </w:p>
+        <w:p>
+          <w:pPr>
+            <w:widowControl w:val="0"/>
+            <w:tabs>
+              <w:tab w:val="right" w:leader="dot" w:pos="9745.511811023624"/>
+            </w:tabs>
+            <w:spacing w:before="60" w:lineRule="auto"/>
+            <w:ind w:left="360" w:firstLine="0"/>
+            <w:rPr>
+              <w:color w:val="000000"/>
+              <w:u w:val="none"/>
+            </w:rPr>
+          </w:pPr>
+          <w:hyperlink w:anchor="_heading=">
+            <w:r>
+              <w:rPr>
+                <w:color w:val="000000"/>
+                <w:u w:val="none"/>
+                <w:rtl w:val="0"/>
+              </w:rPr>
+              <w:t xml:space="preserve">7.1 빌드 순서</w:t>
+              <w:tab/>
+            </w:r>
+          </w:hyperlink>
+          <w:r>
+            <w:fldChar w:fldCharType="begin"/>
+            <w:instrText xml:space="preserve"> PAGEREF _heading= \h </w:instrText>
+            <w:fldChar w:fldCharType="separate"/>
+          </w:r>
+          <w:r>
+            <w:rPr>
+              <w:rtl w:val="0"/>
+            </w:rPr>
+            <w:t xml:space="preserve">13</w:t>
+          </w:r>
+          <w:r>
+            <w:fldChar w:fldCharType="end"/>
+          </w:r>
+          <w:r>
+            <w:rPr>
+              <w:rtl w:val="0"/>
+            </w:rPr>
+          </w:r>
+        </w:p>
+        <w:p>
+          <w:pPr>
+            <w:widowControl w:val="0"/>
+            <w:tabs>
+              <w:tab w:val="right" w:leader="dot" w:pos="9745.511811023624"/>
+            </w:tabs>
+            <w:spacing w:before="60" w:lineRule="auto"/>
+            <w:ind w:left="360" w:firstLine="0"/>
+            <w:rPr>
+              <w:color w:val="000000"/>
+              <w:u w:val="none"/>
+            </w:rPr>
+          </w:pPr>
+          <w:hyperlink w:anchor="_heading=">
+            <w:r>
+              <w:rPr>
+                <w:color w:val="000000"/>
+                <w:u w:val="none"/>
+                <w:rtl w:val="0"/>
+              </w:rPr>
+              <w:t xml:space="preserve">7.2 Validate Design 결과</w:t>
+              <w:tab/>
+            </w:r>
+          </w:hyperlink>
+          <w:r>
+            <w:fldChar w:fldCharType="begin"/>
+            <w:instrText xml:space="preserve"> PAGEREF _heading= \h </w:instrText>
+            <w:fldChar w:fldCharType="separate"/>
+          </w:r>
+          <w:r>
+            <w:rPr>
+              <w:rtl w:val="0"/>
+            </w:rPr>
+            <w:t xml:space="preserve">13</w:t>
+          </w:r>
+          <w:r>
+            <w:fldChar w:fldCharType="end"/>
+          </w:r>
+          <w:r>
+            <w:rPr>
+              <w:rtl w:val="0"/>
+            </w:rPr>
+          </w:r>
+        </w:p>
+        <w:p>
+          <w:pPr>
+            <w:widowControl w:val="0"/>
+            <w:tabs>
+              <w:tab w:val="right" w:leader="dot" w:pos="9745.511811023624"/>
+            </w:tabs>
+            <w:spacing w:before="60" w:lineRule="auto"/>
+            <w:ind w:left="360" w:firstLine="0"/>
+            <w:rPr>
+              <w:color w:val="000000"/>
+              <w:u w:val="none"/>
+            </w:rPr>
+          </w:pPr>
+          <w:hyperlink w:anchor="_heading=">
+            <w:r>
+              <w:rPr>
+                <w:color w:val="000000"/>
+                <w:u w:val="none"/>
+                <w:rtl w:val="0"/>
+              </w:rPr>
+              <w:t xml:space="preserve">7.3 비트스트림 생성 확인</w:t>
+              <w:tab/>
+            </w:r>
+          </w:hyperlink>
+          <w:r>
+            <w:fldChar w:fldCharType="begin"/>
+            <w:instrText xml:space="preserve"> PAGEREF _heading= \h </w:instrText>
+            <w:fldChar w:fldCharType="separate"/>
+          </w:r>
+          <w:r>
+            <w:rPr>
+              <w:rtl w:val="0"/>
+            </w:rPr>
+            <w:t xml:space="preserve">13</w:t>
+          </w:r>
+          <w:r>
+            <w:fldChar w:fldCharType="end"/>
+          </w:r>
+          <w:r>
+            <w:rPr>
+              <w:rtl w:val="0"/>
+            </w:rPr>
+          </w:r>
+        </w:p>
+        <w:p>
+          <w:pPr>
+            <w:widowControl w:val="0"/>
+            <w:tabs>
+              <w:tab w:val="right" w:leader="dot" w:pos="9745.511811023624"/>
+            </w:tabs>
+            <w:spacing w:before="60" w:lineRule="auto"/>
+            <w:rPr>
+              <w:b w:val="1"/>
+              <w:bCs w:val="1"/>
+              <w:color w:val="000000"/>
+              <w:u w:val="none"/>
+            </w:rPr>
+          </w:pPr>
+          <w:hyperlink w:anchor="_heading=">
+            <w:r>
+              <w:rPr>
+                <w:b w:val="1"/>
+                <w:bCs w:val="1"/>
+                <w:color w:val="000000"/>
+                <w:u w:val="none"/>
+                <w:rtl w:val="0"/>
+              </w:rPr>
+              <w:t xml:space="preserve">8. 트러블슈팅</w:t>
+              <w:tab/>
+            </w:r>
+          </w:hyperlink>
+          <w:r>
+            <w:fldChar w:fldCharType="begin"/>
+            <w:instrText xml:space="preserve"> PAGEREF _heading= \h </w:instrText>
+            <w:fldChar w:fldCharType="separate"/>
+          </w:r>
+          <w:r>
+            <w:rPr>
+              <w:b w:val="1"/>
+              <w:bCs w:val="1"/>
+              <w:rtl w:val="0"/>
+            </w:rPr>
+            <w:t xml:space="preserve">14</w:t>
+          </w:r>
+          <w:r>
+            <w:fldChar w:fldCharType="end"/>
+          </w:r>
+          <w:r>
+            <w:rPr>
+              <w:rtl w:val="0"/>
+            </w:rPr>
+          </w:r>
+        </w:p>
+        <w:p>
+          <w:pPr>
+            <w:widowControl w:val="0"/>
+            <w:tabs>
+              <w:tab w:val="right" w:leader="dot" w:pos="9745.511811023624"/>
+            </w:tabs>
+            <w:spacing w:before="60" w:lineRule="auto"/>
+            <w:ind w:left="360" w:firstLine="0"/>
+            <w:rPr>
+              <w:color w:val="000000"/>
+              <w:u w:val="none"/>
+            </w:rPr>
+          </w:pPr>
+          <w:hyperlink w:anchor="_heading=">
+            <w:r>
+              <w:rPr>
+                <w:color w:val="000000"/>
+                <w:u w:val="none"/>
+                <w:rtl w:val="0"/>
+              </w:rPr>
+              <w:t xml:space="preserve">8.1 주요 에러 및 해결 방법</w:t>
+              <w:tab/>
+            </w:r>
+          </w:hyperlink>
+          <w:r>
+            <w:fldChar w:fldCharType="begin"/>
+            <w:instrText xml:space="preserve"> PAGEREF _heading= \h </w:instrText>
+            <w:fldChar w:fldCharType="separate"/>
+          </w:r>
+          <w:r>
+            <w:rPr>
+              <w:rtl w:val="0"/>
+            </w:rPr>
+            <w:t xml:space="preserve">14</w:t>
+          </w:r>
+          <w:r>
+            <w:fldChar w:fldCharType="end"/>
+          </w:r>
+          <w:r>
+            <w:rPr>
+              <w:rtl w:val="0"/>
+            </w:rPr>
+          </w:r>
+        </w:p>
+        <w:p>
+          <w:pPr>
+            <w:widowControl w:val="0"/>
+            <w:tabs>
+              <w:tab w:val="right" w:leader="dot" w:pos="9745.511811023624"/>
+            </w:tabs>
+            <w:spacing w:before="60" w:lineRule="auto"/>
+            <w:ind w:left="360" w:firstLine="0"/>
+            <w:rPr>
+              <w:color w:val="000000"/>
+              <w:u w:val="none"/>
+            </w:rPr>
+          </w:pPr>
+          <w:hyperlink w:anchor="_heading=">
+            <w:r>
+              <w:rPr>
+                <w:color w:val="000000"/>
+                <w:u w:val="none"/>
+                <w:rtl w:val="0"/>
+              </w:rPr>
+              <w:t xml:space="preserve">8.2 패키징 시 주의사항</w:t>
+              <w:tab/>
+            </w:r>
+          </w:hyperlink>
+          <w:r>
+            <w:fldChar w:fldCharType="begin"/>
+            <w:instrText xml:space="preserve"> PAGEREF _heading= \h </w:instrText>
+            <w:fldChar w:fldCharType="separate"/>
+          </w:r>
+          <w:r>
+            <w:rPr>
+              <w:rtl w:val="0"/>
+            </w:rPr>
+            <w:t xml:space="preserve">14</w:t>
+          </w:r>
+          <w:r>
+            <w:fldChar w:fldCharType="end"/>
+          </w:r>
+          <w:r>
+            <w:rPr>
+              <w:rtl w:val="0"/>
+            </w:rPr>
+          </w:r>
+        </w:p>
+        <w:p>
+          <w:pPr>
+            <w:widowControl w:val="0"/>
+            <w:tabs>
+              <w:tab w:val="right" w:leader="dot" w:pos="9745.511811023624"/>
+            </w:tabs>
+            <w:spacing w:before="60" w:lineRule="auto"/>
+            <w:rPr>
+              <w:b w:val="1"/>
+              <w:bCs w:val="1"/>
+              <w:color w:val="000000"/>
+              <w:u w:val="none"/>
+            </w:rPr>
+          </w:pPr>
+          <w:hyperlink w:anchor="_heading=">
+            <w:r>
+              <w:rPr>
+                <w:b w:val="1"/>
+                <w:bCs w:val="1"/>
+                <w:color w:val="000000"/>
+                <w:u w:val="none"/>
+                <w:rtl w:val="0"/>
+              </w:rPr>
+              <w:t xml:space="preserve">9. 향후 구현 과제</w:t>
+              <w:tab/>
+            </w:r>
+          </w:hyperlink>
+          <w:r>
+            <w:fldChar w:fldCharType="begin"/>
+            <w:instrText xml:space="preserve"> PAGEREF _heading= \h </w:instrText>
+            <w:fldChar w:fldCharType="separate"/>
+          </w:r>
+          <w:r>
+            <w:rPr>
+              <w:b w:val="1"/>
+              <w:bCs w:val="1"/>
+              <w:rtl w:val="0"/>
+            </w:rPr>
+            <w:t xml:space="preserve">15</w:t>
+          </w:r>
+          <w:r>
+            <w:fldChar w:fldCharType="end"/>
+          </w:r>
+          <w:r>
+            <w:rPr>
+              <w:rtl w:val="0"/>
+            </w:rPr>
+          </w:r>
+        </w:p>
+        <w:p>
+          <w:pPr>
+            <w:widowControl w:val="0"/>
+            <w:tabs>
+              <w:tab w:val="right" w:leader="dot" w:pos="9745.511811023624"/>
+            </w:tabs>
+            <w:spacing w:before="60" w:lineRule="auto"/>
+            <w:rPr>
+              <w:b w:val="1"/>
+              <w:bCs w:val="1"/>
+              <w:color w:val="000000"/>
+              <w:u w:val="none"/>
+            </w:rPr>
+          </w:pPr>
+          <w:hyperlink w:anchor="_heading=">
+            <w:r>
+              <w:rPr>
+                <w:b w:val="1"/>
+                <w:bCs w:val="1"/>
+                <w:color w:val="000000"/>
+                <w:u w:val="none"/>
+                <w:rtl w:val="0"/>
+              </w:rPr>
+              <w:t xml:space="preserve">부록 A. 포트 신호 목록</w:t>
+              <w:tab/>
+            </w:r>
+          </w:hyperlink>
+          <w:r>
+            <w:fldChar w:fldCharType="begin"/>
+            <w:instrText xml:space="preserve"> PAGEREF _heading= \h </w:instrText>
+            <w:fldChar w:fldCharType="separate"/>
+          </w:r>
+          <w:r>
+            <w:rPr>
+              <w:b w:val="1"/>
+              <w:bCs w:val="1"/>
+              <w:rtl w:val="0"/>
+            </w:rPr>
+            <w:t xml:space="preserve">15</w:t>
+          </w:r>
+          <w:r>
+            <w:fldChar w:fldCharType="end"/>
+          </w:r>
+          <w:r>
+            <w:rPr>
+              <w:rtl w:val="0"/>
+            </w:rPr>
+          </w:r>
+        </w:p>
+        <w:p>
+          <w:pPr>
+            <w:widowControl w:val="0"/>
+            <w:tabs>
+              <w:tab w:val="right" w:leader="dot" w:pos="9745.511811023624"/>
+            </w:tabs>
+            <w:spacing w:before="60" w:lineRule="auto"/>
+            <w:ind w:left="360" w:firstLine="0"/>
+            <w:rPr>
+              <w:color w:val="000000"/>
+              <w:u w:val="none"/>
+            </w:rPr>
+          </w:pPr>
+          <w:hyperlink w:anchor="_heading=">
+            <w:r>
+              <w:rPr>
+                <w:color w:val="000000"/>
+                <w:u w:val="none"/>
+                <w:rtl w:val="0"/>
+              </w:rPr>
+              <w:t xml:space="preserve">A.1 soc_design_wrapper 최종 포트</w:t>
+              <w:tab/>
+            </w:r>
+          </w:hyperlink>
+          <w:r>
+            <w:fldChar w:fldCharType="begin"/>
+            <w:instrText xml:space="preserve"> PAGEREF _heading= \h </w:instrText>
+            <w:fldChar w:fldCharType="separate"/>
+          </w:r>
+          <w:r>
+            <w:rPr>
+              <w:rtl w:val="0"/>
+            </w:rPr>
+            <w:t xml:space="preserve">15</w:t>
+          </w:r>
+          <w:r>
+            <w:fldChar w:fldCharType="end"/>
+          </w:r>
+          <w:r>
+            <w:rPr>
+              <w:rtl w:val="0"/>
+            </w:rPr>
+          </w:r>
+          <w:r>
+            <w:fldChar w:fldCharType="end"/>
+          </w:r>
+        </w:p>
+      </w:sdtContent>
+    </w:sdt>
+    <w:p>
+      <w:pPr>
+        <w:rPr/>
+      </w:pPr>
+      <w:r>
+        <w:rPr>
+          <w:rtl w:val="0"/>
+        </w:rPr>
+      </w:r>
+    </w:p>
     <w:p>
       <w:pPr>
         <w:pStyle w:val="Heading1"/>
@@ -607,9 +2490,24 @@
         <w:spacing w:after="200" w:before="400" w:lineRule="auto"/>
         <w:rPr/>
       </w:pPr>
+      <w:r>
+        <w:rPr>
+          <w:rtl w:val="0"/>
+        </w:rPr>
+      </w:r>
+    </w:p>
+    <w:p>
+      <w:pPr>
+        <w:pStyle w:val="Heading1"/>
+        <w:pBdr>
+          <w:bottom w:color="2e75b6" w:space="1" w:sz="6" w:val="single"/>
+        </w:pBdr>
+        <w:spacing w:after="200" w:before="400" w:lineRule="auto"/>
+        <w:rPr/>
+      </w:pPr>
       <w:sdt>
         <w:sdtPr>
-          <w:id w:val="1441121039"/>
+          <w:id w:val="-929573886"/>
           <w:tag w:val="goog_rdk_8"/>
         </w:sdtPr>
         <w:sdtContent>
@@ -641,7 +2539,7 @@
       </w:pPr>
       <w:sdt>
         <w:sdtPr>
-          <w:id w:val="-1259923001"/>
+          <w:id w:val="1120472109"/>
           <w:tag w:val="goog_rdk_9"/>
         </w:sdtPr>
         <w:sdtContent>
@@ -672,7 +2570,7 @@
       </w:pPr>
       <w:sdt>
         <w:sdtPr>
-          <w:id w:val="-617347531"/>
+          <w:id w:val="-1380140405"/>
           <w:tag w:val="goog_rdk_10"/>
         </w:sdtPr>
         <w:sdtContent>
@@ -712,7 +2610,7 @@
       </w:pPr>
       <w:sdt>
         <w:sdtPr>
-          <w:id w:val="-1105597123"/>
+          <w:id w:val="-1926578846"/>
           <w:tag w:val="goog_rdk_11"/>
         </w:sdtPr>
         <w:sdtContent>
@@ -753,7 +2651,7 @@
       </w:pPr>
       <w:sdt>
         <w:sdtPr>
-          <w:id w:val="1101839507"/>
+          <w:id w:val="-1110249547"/>
           <w:tag w:val="goog_rdk_12"/>
         </w:sdtPr>
         <w:sdtContent>
@@ -789,12 +2687,12 @@
           <wp:inline distB="0" distT="0" distL="0" distR="0">
             <wp:extent cx="5715000" cy="1238250"/>
             <wp:effectExtent b="0" l="0" r="0" t="0"/>
-            <wp:docPr id="2" name="image3.jpg"/>
+            <wp:docPr id="2" name="image2.jpg"/>
             <a:graphic>
               <a:graphicData uri="http://schemas.openxmlformats.org/drawingml/2006/picture">
                 <pic:pic>
                   <pic:nvPicPr>
-                    <pic:cNvPr id="0" name="image3.jpg"/>
+                    <pic:cNvPr id="0" name="image2.jpg"/>
                     <pic:cNvPicPr preferRelativeResize="0"/>
                   </pic:nvPicPr>
                   <pic:blipFill>
@@ -832,7 +2730,7 @@
       </w:pPr>
       <w:sdt>
         <w:sdtPr>
-          <w:id w:val="789661506"/>
+          <w:id w:val="-1849057226"/>
           <w:tag w:val="goog_rdk_13"/>
         </w:sdtPr>
         <w:sdtContent>
@@ -911,7 +2809,7 @@
             </w:pPr>
             <w:sdt>
               <w:sdtPr>
-                <w:id w:val="-1167665895"/>
+                <w:id w:val="-744390060"/>
                 <w:tag w:val="goog_rdk_14"/>
               </w:sdtPr>
               <w:sdtContent>
@@ -958,7 +2856,7 @@
             </w:pPr>
             <w:sdt>
               <w:sdtPr>
-                <w:id w:val="-180484930"/>
+                <w:id w:val="-1133137647"/>
                 <w:tag w:val="goog_rdk_15"/>
               </w:sdtPr>
               <w:sdtContent>
@@ -1005,7 +2903,7 @@
             </w:pPr>
             <w:sdt>
               <w:sdtPr>
-                <w:id w:val="1605763554"/>
+                <w:id w:val="-1023109330"/>
                 <w:tag w:val="goog_rdk_16"/>
               </w:sdtPr>
               <w:sdtContent>
@@ -1058,7 +2956,7 @@
             </w:pPr>
             <w:sdt>
               <w:sdtPr>
-                <w:id w:val="-1116531909"/>
+                <w:id w:val="218790900"/>
                 <w:tag w:val="goog_rdk_17"/>
               </w:sdtPr>
               <w:sdtContent>
@@ -1103,7 +3001,7 @@
             </w:pPr>
             <w:sdt>
               <w:sdtPr>
-                <w:id w:val="-1518879527"/>
+                <w:id w:val="-1451250810"/>
                 <w:tag w:val="goog_rdk_18"/>
               </w:sdtPr>
               <w:sdtContent>
@@ -1148,7 +3046,7 @@
             </w:pPr>
             <w:sdt>
               <w:sdtPr>
-                <w:id w:val="-1959278991"/>
+                <w:id w:val="-1146829562"/>
                 <w:tag w:val="goog_rdk_19"/>
               </w:sdtPr>
               <w:sdtContent>
@@ -1199,7 +3097,7 @@
             </w:pPr>
             <w:sdt>
               <w:sdtPr>
-                <w:id w:val="1653623371"/>
+                <w:id w:val="-563072512"/>
                 <w:tag w:val="goog_rdk_20"/>
               </w:sdtPr>
               <w:sdtContent>
@@ -1244,7 +3142,7 @@
             </w:pPr>
             <w:sdt>
               <w:sdtPr>
-                <w:id w:val="-594653886"/>
+                <w:id w:val="820331930"/>
                 <w:tag w:val="goog_rdk_21"/>
               </w:sdtPr>
               <w:sdtContent>
@@ -1289,7 +3187,7 @@
             </w:pPr>
             <w:sdt>
               <w:sdtPr>
-                <w:id w:val="-1753934554"/>
+                <w:id w:val="925467080"/>
                 <w:tag w:val="goog_rdk_22"/>
               </w:sdtPr>
               <w:sdtContent>
@@ -1340,7 +3238,7 @@
             </w:pPr>
             <w:sdt>
               <w:sdtPr>
-                <w:id w:val="904155624"/>
+                <w:id w:val="-1638198210"/>
                 <w:tag w:val="goog_rdk_23"/>
               </w:sdtPr>
               <w:sdtContent>
@@ -1385,7 +3283,7 @@
             </w:pPr>
             <w:sdt>
               <w:sdtPr>
-                <w:id w:val="-1416359755"/>
+                <w:id w:val="1615816633"/>
                 <w:tag w:val="goog_rdk_24"/>
               </w:sdtPr>
               <w:sdtContent>
@@ -1430,7 +3328,7 @@
             </w:pPr>
             <w:sdt>
               <w:sdtPr>
-                <w:id w:val="-390069283"/>
+                <w:id w:val="1471588407"/>
                 <w:tag w:val="goog_rdk_25"/>
               </w:sdtPr>
               <w:sdtContent>
@@ -1481,7 +3379,7 @@
             </w:pPr>
             <w:sdt>
               <w:sdtPr>
-                <w:id w:val="-1237451044"/>
+                <w:id w:val="2002047415"/>
                 <w:tag w:val="goog_rdk_26"/>
               </w:sdtPr>
               <w:sdtContent>
@@ -1526,7 +3424,7 @@
             </w:pPr>
             <w:sdt>
               <w:sdtPr>
-                <w:id w:val="136057931"/>
+                <w:id w:val="-66021876"/>
                 <w:tag w:val="goog_rdk_27"/>
               </w:sdtPr>
               <w:sdtContent>
@@ -1571,7 +3469,7 @@
             </w:pPr>
             <w:sdt>
               <w:sdtPr>
-                <w:id w:val="1907605991"/>
+                <w:id w:val="-1722260472"/>
                 <w:tag w:val="goog_rdk_28"/>
               </w:sdtPr>
               <w:sdtContent>
@@ -1615,7 +3513,7 @@
       </w:pPr>
       <w:sdt>
         <w:sdtPr>
-          <w:id w:val="1535731215"/>
+          <w:id w:val="-2053281406"/>
           <w:tag w:val="goog_rdk_29"/>
         </w:sdtPr>
         <w:sdtContent>
@@ -1694,7 +3592,7 @@
       </w:pPr>
       <w:sdt>
         <w:sdtPr>
-          <w:id w:val="-27976725"/>
+          <w:id w:val="-1880034284"/>
           <w:tag w:val="goog_rdk_30"/>
         </w:sdtPr>
         <w:sdtContent>
@@ -1773,7 +3671,7 @@
             </w:pPr>
             <w:sdt>
               <w:sdtPr>
-                <w:id w:val="1448441011"/>
+                <w:id w:val="400179786"/>
                 <w:tag w:val="goog_rdk_31"/>
               </w:sdtPr>
               <w:sdtContent>
@@ -1820,7 +3718,7 @@
             </w:pPr>
             <w:sdt>
               <w:sdtPr>
-                <w:id w:val="-1829666885"/>
+                <w:id w:val="756559223"/>
                 <w:tag w:val="goog_rdk_32"/>
               </w:sdtPr>
               <w:sdtContent>
@@ -1867,7 +3765,7 @@
             </w:pPr>
             <w:sdt>
               <w:sdtPr>
-                <w:id w:val="2120268201"/>
+                <w:id w:val="1725175386"/>
                 <w:tag w:val="goog_rdk_33"/>
               </w:sdtPr>
               <w:sdtContent>
@@ -1957,7 +3855,7 @@
             </w:pPr>
             <w:sdt>
               <w:sdtPr>
-                <w:id w:val="1948375220"/>
+                <w:id w:val="-712905694"/>
                 <w:tag w:val="goog_rdk_34"/>
               </w:sdtPr>
               <w:sdtContent>
@@ -2002,7 +3900,7 @@
             </w:pPr>
             <w:sdt>
               <w:sdtPr>
-                <w:id w:val="-1488940998"/>
+                <w:id w:val="2145763209"/>
                 <w:tag w:val="goog_rdk_35"/>
               </w:sdtPr>
               <w:sdtContent>
@@ -2090,7 +3988,7 @@
             </w:pPr>
             <w:sdt>
               <w:sdtPr>
-                <w:id w:val="161246796"/>
+                <w:id w:val="-2137848139"/>
                 <w:tag w:val="goog_rdk_36"/>
               </w:sdtPr>
               <w:sdtContent>
@@ -2135,7 +4033,7 @@
             </w:pPr>
             <w:sdt>
               <w:sdtPr>
-                <w:id w:val="368860907"/>
+                <w:id w:val="-1553516742"/>
                 <w:tag w:val="goog_rdk_37"/>
               </w:sdtPr>
               <w:sdtContent>
@@ -2223,7 +4121,7 @@
             </w:pPr>
             <w:sdt>
               <w:sdtPr>
-                <w:id w:val="65160024"/>
+                <w:id w:val="1863488142"/>
                 <w:tag w:val="goog_rdk_38"/>
               </w:sdtPr>
               <w:sdtContent>
@@ -2268,7 +4166,7 @@
             </w:pPr>
             <w:sdt>
               <w:sdtPr>
-                <w:id w:val="812517198"/>
+                <w:id w:val="1904911218"/>
                 <w:tag w:val="goog_rdk_39"/>
               </w:sdtPr>
               <w:sdtContent>
@@ -2356,7 +4254,7 @@
             </w:pPr>
             <w:sdt>
               <w:sdtPr>
-                <w:id w:val="1085773929"/>
+                <w:id w:val="-1579358913"/>
                 <w:tag w:val="goog_rdk_40"/>
               </w:sdtPr>
               <w:sdtContent>
@@ -2401,7 +4299,7 @@
             </w:pPr>
             <w:sdt>
               <w:sdtPr>
-                <w:id w:val="894035374"/>
+                <w:id w:val="-2125849798"/>
                 <w:tag w:val="goog_rdk_41"/>
               </w:sdtPr>
               <w:sdtContent>
@@ -2489,7 +4387,7 @@
             </w:pPr>
             <w:sdt>
               <w:sdtPr>
-                <w:id w:val="1607431577"/>
+                <w:id w:val="-795880736"/>
                 <w:tag w:val="goog_rdk_42"/>
               </w:sdtPr>
               <w:sdtContent>
@@ -2534,7 +4432,7 @@
             </w:pPr>
             <w:sdt>
               <w:sdtPr>
-                <w:id w:val="-1890395484"/>
+                <w:id w:val="1225999315"/>
                 <w:tag w:val="goog_rdk_43"/>
               </w:sdtPr>
               <w:sdtContent>
@@ -2659,7 +4557,7 @@
             </w:pPr>
             <w:sdt>
               <w:sdtPr>
-                <w:id w:val="-852730629"/>
+                <w:id w:val="698086671"/>
                 <w:tag w:val="goog_rdk_44"/>
               </w:sdtPr>
               <w:sdtContent>
@@ -2784,7 +4682,7 @@
             </w:pPr>
             <w:sdt>
               <w:sdtPr>
-                <w:id w:val="1535324421"/>
+                <w:id w:val="738996012"/>
                 <w:tag w:val="goog_rdk_45"/>
               </w:sdtPr>
               <w:sdtContent>
@@ -2909,7 +4807,7 @@
             </w:pPr>
             <w:sdt>
               <w:sdtPr>
-                <w:id w:val="-633959427"/>
+                <w:id w:val="1772025677"/>
                 <w:tag w:val="goog_rdk_46"/>
               </w:sdtPr>
               <w:sdtContent>
@@ -3034,7 +4932,7 @@
             </w:pPr>
             <w:sdt>
               <w:sdtPr>
-                <w:id w:val="1731941826"/>
+                <w:id w:val="1184831473"/>
                 <w:tag w:val="goog_rdk_47"/>
               </w:sdtPr>
               <w:sdtContent>
@@ -3159,7 +5057,7 @@
             </w:pPr>
             <w:sdt>
               <w:sdtPr>
-                <w:id w:val="1672114144"/>
+                <w:id w:val="61288132"/>
                 <w:tag w:val="goog_rdk_48"/>
               </w:sdtPr>
               <w:sdtContent>
@@ -3284,7 +5182,7 @@
             </w:pPr>
             <w:sdt>
               <w:sdtPr>
-                <w:id w:val="1024699826"/>
+                <w:id w:val="-542054408"/>
                 <w:tag w:val="goog_rdk_49"/>
               </w:sdtPr>
               <w:sdtContent>
@@ -3409,7 +5307,7 @@
             </w:pPr>
             <w:sdt>
               <w:sdtPr>
-                <w:id w:val="1871195912"/>
+                <w:id w:val="-683604516"/>
                 <w:tag w:val="goog_rdk_50"/>
               </w:sdtPr>
               <w:sdtContent>
@@ -3534,7 +5432,7 @@
             </w:pPr>
             <w:sdt>
               <w:sdtPr>
-                <w:id w:val="1291783501"/>
+                <w:id w:val="-71260331"/>
                 <w:tag w:val="goog_rdk_51"/>
               </w:sdtPr>
               <w:sdtContent>
@@ -3594,7 +5492,7 @@
       </w:pPr>
       <w:sdt>
         <w:sdtPr>
-          <w:id w:val="1029139628"/>
+          <w:id w:val="-1070401222"/>
           <w:tag w:val="goog_rdk_52"/>
         </w:sdtPr>
         <w:sdtContent>
@@ -3626,7 +5524,7 @@
       </w:pPr>
       <w:sdt>
         <w:sdtPr>
-          <w:id w:val="457151316"/>
+          <w:id w:val="-1569965772"/>
           <w:tag w:val="goog_rdk_53"/>
         </w:sdtPr>
         <w:sdtContent>
@@ -3703,7 +5601,7 @@
             </w:pPr>
             <w:sdt>
               <w:sdtPr>
-                <w:id w:val="-224351208"/>
+                <w:id w:val="-1630196606"/>
                 <w:tag w:val="goog_rdk_54"/>
               </w:sdtPr>
               <w:sdtContent>
@@ -3750,7 +5648,7 @@
             </w:pPr>
             <w:sdt>
               <w:sdtPr>
-                <w:id w:val="-242750668"/>
+                <w:id w:val="-944174210"/>
                 <w:tag w:val="goog_rdk_55"/>
               </w:sdtPr>
               <w:sdtContent>
@@ -3803,7 +5701,7 @@
             </w:pPr>
             <w:sdt>
               <w:sdtPr>
-                <w:id w:val="2142237878"/>
+                <w:id w:val="188604347"/>
                 <w:tag w:val="goog_rdk_56"/>
               </w:sdtPr>
               <w:sdtContent>
@@ -4284,7 +6182,7 @@
       </w:pPr>
       <w:sdt>
         <w:sdtPr>
-          <w:id w:val="1522482193"/>
+          <w:id w:val="793091578"/>
           <w:tag w:val="goog_rdk_57"/>
         </w:sdtPr>
         <w:sdtContent>
@@ -4361,7 +6259,7 @@
             </w:pPr>
             <w:sdt>
               <w:sdtPr>
-                <w:id w:val="-1815438110"/>
+                <w:id w:val="-112443946"/>
                 <w:tag w:val="goog_rdk_58"/>
               </w:sdtPr>
               <w:sdtContent>
@@ -4408,7 +6306,7 @@
             </w:pPr>
             <w:sdt>
               <w:sdtPr>
-                <w:id w:val="-864138787"/>
+                <w:id w:val="-495779834"/>
                 <w:tag w:val="goog_rdk_59"/>
               </w:sdtPr>
               <w:sdtContent>
@@ -4621,7 +6519,7 @@
             </w:pPr>
             <w:sdt>
               <w:sdtPr>
-                <w:id w:val="-1505992729"/>
+                <w:id w:val="741299932"/>
                 <w:tag w:val="goog_rdk_60"/>
               </w:sdtPr>
               <w:sdtContent>
@@ -4666,7 +6564,7 @@
             </w:pPr>
             <w:sdt>
               <w:sdtPr>
-                <w:id w:val="499156850"/>
+                <w:id w:val="837005865"/>
                 <w:tag w:val="goog_rdk_61"/>
               </w:sdtPr>
               <w:sdtContent>
@@ -4710,7 +6608,7 @@
       </w:pPr>
       <w:sdt>
         <w:sdtPr>
-          <w:id w:val="-918675308"/>
+          <w:id w:val="2107587823"/>
           <w:tag w:val="goog_rdk_62"/>
         </w:sdtPr>
         <w:sdtContent>
@@ -4741,7 +6639,7 @@
       </w:pPr>
       <w:sdt>
         <w:sdtPr>
-          <w:id w:val="-1599331645"/>
+          <w:id w:val="-1734376530"/>
           <w:tag w:val="goog_rdk_63"/>
         </w:sdtPr>
         <w:sdtContent>
@@ -4829,7 +6727,7 @@
             </w:pPr>
             <w:sdt>
               <w:sdtPr>
-                <w:id w:val="1593507615"/>
+                <w:id w:val="-69562251"/>
                 <w:tag w:val="goog_rdk_64"/>
               </w:sdtPr>
               <w:sdtContent>
@@ -4997,7 +6895,7 @@
             </w:pPr>
             <w:sdt>
               <w:sdtPr>
-                <w:id w:val="33574637"/>
+                <w:id w:val="-100508908"/>
                 <w:tag w:val="goog_rdk_65"/>
               </w:sdtPr>
               <w:sdtContent>
@@ -5042,7 +6940,7 @@
             </w:pPr>
             <w:sdt>
               <w:sdtPr>
-                <w:id w:val="-165763886"/>
+                <w:id w:val="-1982137591"/>
                 <w:tag w:val="goog_rdk_66"/>
               </w:sdtPr>
               <w:sdtContent>
@@ -5130,7 +7028,7 @@
             </w:pPr>
             <w:sdt>
               <w:sdtPr>
-                <w:id w:val="334055907"/>
+                <w:id w:val="-2053765363"/>
                 <w:tag w:val="goog_rdk_67"/>
               </w:sdtPr>
               <w:sdtContent>
@@ -5175,7 +7073,7 @@
             </w:pPr>
             <w:sdt>
               <w:sdtPr>
-                <w:id w:val="-996021676"/>
+                <w:id w:val="-1822990363"/>
                 <w:tag w:val="goog_rdk_68"/>
               </w:sdtPr>
               <w:sdtContent>
@@ -5226,7 +7124,7 @@
             </w:pPr>
             <w:sdt>
               <w:sdtPr>
-                <w:id w:val="-940708999"/>
+                <w:id w:val="1532329614"/>
                 <w:tag w:val="goog_rdk_69"/>
               </w:sdtPr>
               <w:sdtContent>
@@ -5271,7 +7169,7 @@
             </w:pPr>
             <w:sdt>
               <w:sdtPr>
-                <w:id w:val="188300531"/>
+                <w:id w:val="575849242"/>
                 <w:tag w:val="goog_rdk_70"/>
               </w:sdtPr>
               <w:sdtContent>
@@ -5316,7 +7214,7 @@
             </w:pPr>
             <w:sdt>
               <w:sdtPr>
-                <w:id w:val="1017297237"/>
+                <w:id w:val="-908447732"/>
                 <w:tag w:val="goog_rdk_71"/>
               </w:sdtPr>
               <w:sdtContent>
@@ -5367,7 +7265,7 @@
             </w:pPr>
             <w:sdt>
               <w:sdtPr>
-                <w:id w:val="1679450878"/>
+                <w:id w:val="308489873"/>
                 <w:tag w:val="goog_rdk_72"/>
               </w:sdtPr>
               <w:sdtContent>
@@ -5412,7 +7310,7 @@
             </w:pPr>
             <w:sdt>
               <w:sdtPr>
-                <w:id w:val="-1811232593"/>
+                <w:id w:val="-2066068333"/>
                 <w:tag w:val="goog_rdk_73"/>
               </w:sdtPr>
               <w:sdtContent>
@@ -5457,7 +7355,7 @@
             </w:pPr>
             <w:sdt>
               <w:sdtPr>
-                <w:id w:val="-1023046857"/>
+                <w:id w:val="-1630792037"/>
                 <w:tag w:val="goog_rdk_74"/>
               </w:sdtPr>
               <w:sdtContent>
@@ -5545,7 +7443,7 @@
             </w:pPr>
             <w:sdt>
               <w:sdtPr>
-                <w:id w:val="2001661812"/>
+                <w:id w:val="2003380117"/>
                 <w:tag w:val="goog_rdk_75"/>
               </w:sdtPr>
               <w:sdtContent>
@@ -5590,7 +7488,7 @@
             </w:pPr>
             <w:sdt>
               <w:sdtPr>
-                <w:id w:val="81248955"/>
+                <w:id w:val="1077674309"/>
                 <w:tag w:val="goog_rdk_76"/>
               </w:sdtPr>
               <w:sdtContent>
@@ -5641,7 +7539,7 @@
             </w:pPr>
             <w:sdt>
               <w:sdtPr>
-                <w:id w:val="-1342698923"/>
+                <w:id w:val="953751552"/>
                 <w:tag w:val="goog_rdk_77"/>
               </w:sdtPr>
               <w:sdtContent>
@@ -5686,7 +7584,7 @@
             </w:pPr>
             <w:sdt>
               <w:sdtPr>
-                <w:id w:val="145439215"/>
+                <w:id w:val="-441091598"/>
                 <w:tag w:val="goog_rdk_78"/>
               </w:sdtPr>
               <w:sdtContent>
@@ -5731,7 +7629,7 @@
             </w:pPr>
             <w:sdt>
               <w:sdtPr>
-                <w:id w:val="241261230"/>
+                <w:id w:val="-1355777171"/>
                 <w:tag w:val="goog_rdk_79"/>
               </w:sdtPr>
               <w:sdtContent>
@@ -5830,7 +7728,7 @@
             </w:r>
             <w:sdt>
               <w:sdtPr>
-                <w:id w:val="-1108607693"/>
+                <w:id w:val="1982303150"/>
                 <w:tag w:val="goog_rdk_80"/>
               </w:sdtPr>
               <w:sdtContent>
@@ -5890,7 +7788,7 @@
       </w:pPr>
       <w:sdt>
         <w:sdtPr>
-          <w:id w:val="753156195"/>
+          <w:id w:val="-182862329"/>
           <w:tag w:val="goog_rdk_81"/>
         </w:sdtPr>
         <w:sdtContent>
@@ -5945,7 +7843,7 @@
       </w:pPr>
       <w:sdt>
         <w:sdtPr>
-          <w:id w:val="-1878130071"/>
+          <w:id w:val="632967493"/>
           <w:tag w:val="goog_rdk_82"/>
         </w:sdtPr>
         <w:sdtContent>
@@ -6033,7 +7931,7 @@
             </w:pPr>
             <w:sdt>
               <w:sdtPr>
-                <w:id w:val="1066325289"/>
+                <w:id w:val="894471812"/>
                 <w:tag w:val="goog_rdk_83"/>
               </w:sdtPr>
               <w:sdtContent>
@@ -6080,7 +7978,7 @@
             </w:pPr>
             <w:sdt>
               <w:sdtPr>
-                <w:id w:val="2080092348"/>
+                <w:id w:val="924341513"/>
                 <w:tag w:val="goog_rdk_84"/>
               </w:sdtPr>
               <w:sdtContent>
@@ -6127,7 +8025,7 @@
             </w:pPr>
             <w:sdt>
               <w:sdtPr>
-                <w:id w:val="-1924453575"/>
+                <w:id w:val="1225563968"/>
                 <w:tag w:val="goog_rdk_85"/>
               </w:sdtPr>
               <w:sdtContent>
@@ -6254,7 +8152,7 @@
             </w:pPr>
             <w:sdt>
               <w:sdtPr>
-                <w:id w:val="-1558034657"/>
+                <w:id w:val="-163197794"/>
                 <w:tag w:val="goog_rdk_86"/>
               </w:sdtPr>
               <w:sdtContent>
@@ -6379,7 +8277,7 @@
             </w:pPr>
             <w:sdt>
               <w:sdtPr>
-                <w:id w:val="-243977444"/>
+                <w:id w:val="-1811113588"/>
                 <w:tag w:val="goog_rdk_87"/>
               </w:sdtPr>
               <w:sdtContent>
@@ -6504,7 +8402,7 @@
             </w:pPr>
             <w:sdt>
               <w:sdtPr>
-                <w:id w:val="-1099709036"/>
+                <w:id w:val="337833310"/>
                 <w:tag w:val="goog_rdk_88"/>
               </w:sdtPr>
               <w:sdtContent>
@@ -6592,7 +8490,7 @@
             </w:pPr>
             <w:sdt>
               <w:sdtPr>
-                <w:id w:val="-1472622349"/>
+                <w:id w:val="-840292237"/>
                 <w:tag w:val="goog_rdk_89"/>
               </w:sdtPr>
               <w:sdtContent>
@@ -6637,7 +8535,7 @@
             </w:pPr>
             <w:sdt>
               <w:sdtPr>
-                <w:id w:val="-1358152929"/>
+                <w:id w:val="-2017008458"/>
                 <w:tag w:val="goog_rdk_90"/>
               </w:sdtPr>
               <w:sdtContent>
@@ -6704,7 +8602,7 @@
       </w:pPr>
       <w:sdt>
         <w:sdtPr>
-          <w:id w:val="-50864709"/>
+          <w:id w:val="1066023811"/>
           <w:tag w:val="goog_rdk_91"/>
         </w:sdtPr>
         <w:sdtContent>
@@ -6746,7 +8644,7 @@
       </w:pPr>
       <w:sdt>
         <w:sdtPr>
-          <w:id w:val="-56451162"/>
+          <w:id w:val="28651782"/>
           <w:tag w:val="goog_rdk_92"/>
         </w:sdtPr>
         <w:sdtContent>
@@ -6800,7 +8698,7 @@
       </w:pPr>
       <w:sdt>
         <w:sdtPr>
-          <w:id w:val="1283924167"/>
+          <w:id w:val="-217388365"/>
           <w:tag w:val="goog_rdk_93"/>
         </w:sdtPr>
         <w:sdtContent>
@@ -6831,7 +8729,7 @@
       </w:pPr>
       <w:sdt>
         <w:sdtPr>
-          <w:id w:val="701209228"/>
+          <w:id w:val="348612312"/>
           <w:tag w:val="goog_rdk_94"/>
         </w:sdtPr>
         <w:sdtContent>
@@ -6965,7 +8863,7 @@
             </w:pPr>
             <w:sdt>
               <w:sdtPr>
-                <w:id w:val="1172537244"/>
+                <w:id w:val="-1899849295"/>
                 <w:tag w:val="goog_rdk_95"/>
               </w:sdtPr>
               <w:sdtContent>
@@ -7012,7 +8910,7 @@
             </w:pPr>
             <w:sdt>
               <w:sdtPr>
-                <w:id w:val="-711533095"/>
+                <w:id w:val="230792645"/>
                 <w:tag w:val="goog_rdk_96"/>
               </w:sdtPr>
               <w:sdtContent>
@@ -7059,7 +8957,7 @@
             </w:pPr>
             <w:sdt>
               <w:sdtPr>
-                <w:id w:val="-960992934"/>
+                <w:id w:val="385500060"/>
                 <w:tag w:val="goog_rdk_97"/>
               </w:sdtPr>
               <w:sdtContent>
@@ -7186,7 +9084,7 @@
             </w:pPr>
             <w:sdt>
               <w:sdtPr>
-                <w:id w:val="-9046955"/>
+                <w:id w:val="354947627"/>
                 <w:tag w:val="goog_rdk_98"/>
               </w:sdtPr>
               <w:sdtContent>
@@ -7311,7 +9209,7 @@
             </w:pPr>
             <w:sdt>
               <w:sdtPr>
-                <w:id w:val="-22363318"/>
+                <w:id w:val="-934866873"/>
                 <w:tag w:val="goog_rdk_99"/>
               </w:sdtPr>
               <w:sdtContent>
@@ -7436,7 +9334,7 @@
             </w:pPr>
             <w:sdt>
               <w:sdtPr>
-                <w:id w:val="-404378537"/>
+                <w:id w:val="2068887369"/>
                 <w:tag w:val="goog_rdk_100"/>
               </w:sdtPr>
               <w:sdtContent>
@@ -7503,7 +9401,7 @@
       </w:pPr>
       <w:sdt>
         <w:sdtPr>
-          <w:id w:val="1350228725"/>
+          <w:id w:val="872781537"/>
           <w:tag w:val="goog_rdk_101"/>
         </w:sdtPr>
         <w:sdtContent>
@@ -7567,7 +9465,7 @@
       </w:pPr>
       <w:sdt>
         <w:sdtPr>
-          <w:id w:val="-733904763"/>
+          <w:id w:val="-854342594"/>
           <w:tag w:val="goog_rdk_102"/>
         </w:sdtPr>
         <w:sdtContent>
@@ -7653,7 +9551,7 @@
             </w:pPr>
             <w:sdt>
               <w:sdtPr>
-                <w:id w:val="1531846000"/>
+                <w:id w:val="-205818928"/>
                 <w:tag w:val="goog_rdk_103"/>
               </w:sdtPr>
               <w:sdtContent>
@@ -7700,7 +9598,7 @@
             </w:pPr>
             <w:sdt>
               <w:sdtPr>
-                <w:id w:val="-256204115"/>
+                <w:id w:val="-1540719779"/>
                 <w:tag w:val="goog_rdk_104"/>
               </w:sdtPr>
               <w:sdtContent>
@@ -7790,7 +9688,7 @@
             </w:pPr>
             <w:sdt>
               <w:sdtPr>
-                <w:id w:val="-1662198348"/>
+                <w:id w:val="-1119218338"/>
                 <w:tag w:val="goog_rdk_105"/>
               </w:sdtPr>
               <w:sdtContent>
@@ -7878,7 +9776,7 @@
             </w:pPr>
             <w:sdt>
               <w:sdtPr>
-                <w:id w:val="249727799"/>
+                <w:id w:val="-1317293096"/>
                 <w:tag w:val="goog_rdk_106"/>
               </w:sdtPr>
               <w:sdtContent>
@@ -7966,7 +9864,7 @@
             </w:pPr>
             <w:sdt>
               <w:sdtPr>
-                <w:id w:val="-1480545845"/>
+                <w:id w:val="-1691885332"/>
                 <w:tag w:val="goog_rdk_107"/>
               </w:sdtPr>
               <w:sdtContent>
@@ -8054,7 +9952,7 @@
             </w:pPr>
             <w:sdt>
               <w:sdtPr>
-                <w:id w:val="-1680656871"/>
+                <w:id w:val="-1517689251"/>
                 <w:tag w:val="goog_rdk_108"/>
               </w:sdtPr>
               <w:sdtContent>
@@ -8121,7 +10019,7 @@
       </w:pPr>
       <w:sdt>
         <w:sdtPr>
-          <w:id w:val="690222348"/>
+          <w:id w:val="662902563"/>
           <w:tag w:val="goog_rdk_109"/>
         </w:sdtPr>
         <w:sdtContent>
@@ -8205,7 +10103,7 @@
             </w:pPr>
             <w:sdt>
               <w:sdtPr>
-                <w:id w:val="-855807172"/>
+                <w:id w:val="-1003569048"/>
                 <w:tag w:val="goog_rdk_110"/>
               </w:sdtPr>
               <w:sdtContent>
@@ -8225,7 +10123,7 @@
             </w:sdt>
             <w:sdt>
               <w:sdtPr>
-                <w:id w:val="777787688"/>
+                <w:id w:val="696523755"/>
                 <w:tag w:val="goog_rdk_111"/>
               </w:sdtPr>
               <w:sdtContent>
@@ -8285,7 +10183,7 @@
       </w:pPr>
       <w:sdt>
         <w:sdtPr>
-          <w:id w:val="1078442394"/>
+          <w:id w:val="-921925578"/>
           <w:tag w:val="goog_rdk_112"/>
         </w:sdtPr>
         <w:sdtContent>
@@ -8317,7 +10215,7 @@
       </w:pPr>
       <w:sdt>
         <w:sdtPr>
-          <w:id w:val="-1264388771"/>
+          <w:id w:val="-15007171"/>
           <w:tag w:val="goog_rdk_113"/>
         </w:sdtPr>
         <w:sdtContent>
@@ -8348,7 +10246,7 @@
       </w:pPr>
       <w:sdt>
         <w:sdtPr>
-          <w:id w:val="-1716581603"/>
+          <w:id w:val="2044578756"/>
           <w:tag w:val="goog_rdk_114"/>
         </w:sdtPr>
         <w:sdtContent>
@@ -8434,7 +10332,7 @@
             </w:pPr>
             <w:sdt>
               <w:sdtPr>
-                <w:id w:val="-1690981359"/>
+                <w:id w:val="505316183"/>
                 <w:tag w:val="goog_rdk_115"/>
               </w:sdtPr>
               <w:sdtContent>
@@ -8481,7 +10379,7 @@
             </w:pPr>
             <w:sdt>
               <w:sdtPr>
-                <w:id w:val="-1606160787"/>
+                <w:id w:val="-816830300"/>
                 <w:tag w:val="goog_rdk_116"/>
               </w:sdtPr>
               <w:sdtContent>
@@ -8534,7 +10432,7 @@
             </w:pPr>
             <w:sdt>
               <w:sdtPr>
-                <w:id w:val="1236420374"/>
+                <w:id w:val="1530971322"/>
                 <w:tag w:val="goog_rdk_117"/>
               </w:sdtPr>
               <w:sdtContent>
@@ -8579,7 +10477,7 @@
             </w:pPr>
             <w:sdt>
               <w:sdtPr>
-                <w:id w:val="-59899245"/>
+                <w:id w:val="-190896073"/>
                 <w:tag w:val="goog_rdk_118"/>
               </w:sdtPr>
               <w:sdtContent>
@@ -8630,7 +10528,7 @@
             </w:pPr>
             <w:sdt>
               <w:sdtPr>
-                <w:id w:val="-1855569742"/>
+                <w:id w:val="-557805858"/>
                 <w:tag w:val="goog_rdk_119"/>
               </w:sdtPr>
               <w:sdtContent>
@@ -8675,7 +10573,7 @@
             </w:pPr>
             <w:sdt>
               <w:sdtPr>
-                <w:id w:val="-1542380570"/>
+                <w:id w:val="-1108313227"/>
                 <w:tag w:val="goog_rdk_120"/>
               </w:sdtPr>
               <w:sdtContent>
@@ -8726,7 +10624,7 @@
             </w:pPr>
             <w:sdt>
               <w:sdtPr>
-                <w:id w:val="-1983103934"/>
+                <w:id w:val="-201073571"/>
                 <w:tag w:val="goog_rdk_121"/>
               </w:sdtPr>
               <w:sdtContent>
@@ -8771,7 +10669,7 @@
             </w:pPr>
             <w:sdt>
               <w:sdtPr>
-                <w:id w:val="-1127858705"/>
+                <w:id w:val="1573065830"/>
                 <w:tag w:val="goog_rdk_122"/>
               </w:sdtPr>
               <w:sdtContent>
@@ -8822,7 +10720,7 @@
             </w:pPr>
             <w:sdt>
               <w:sdtPr>
-                <w:id w:val="-141070900"/>
+                <w:id w:val="-1934434187"/>
                 <w:tag w:val="goog_rdk_123"/>
               </w:sdtPr>
               <w:sdtContent>
@@ -8867,7 +10765,7 @@
             </w:pPr>
             <w:sdt>
               <w:sdtPr>
-                <w:id w:val="-216798930"/>
+                <w:id w:val="-1764301506"/>
                 <w:tag w:val="goog_rdk_124"/>
               </w:sdtPr>
               <w:sdtContent>
@@ -8918,7 +10816,7 @@
             </w:pPr>
             <w:sdt>
               <w:sdtPr>
-                <w:id w:val="-2037418717"/>
+                <w:id w:val="532213560"/>
                 <w:tag w:val="goog_rdk_125"/>
               </w:sdtPr>
               <w:sdtContent>
@@ -8963,7 +10861,7 @@
             </w:pPr>
             <w:sdt>
               <w:sdtPr>
-                <w:id w:val="95499832"/>
+                <w:id w:val="-234141802"/>
                 <w:tag w:val="goog_rdk_126"/>
               </w:sdtPr>
               <w:sdtContent>
@@ -9007,7 +10905,7 @@
       </w:pPr>
       <w:sdt>
         <w:sdtPr>
-          <w:id w:val="426226049"/>
+          <w:id w:val="-486349656"/>
           <w:tag w:val="goog_rdk_127"/>
         </w:sdtPr>
         <w:sdtContent>
@@ -9039,7 +10937,7 @@
       </w:pPr>
       <w:sdt>
         <w:sdtPr>
-          <w:id w:val="1067404322"/>
+          <w:id w:val="1796100079"/>
           <w:tag w:val="goog_rdk_128"/>
         </w:sdtPr>
         <w:sdtContent>
@@ -9070,7 +10968,7 @@
       </w:pPr>
       <w:sdt>
         <w:sdtPr>
-          <w:id w:val="1273582424"/>
+          <w:id w:val="-2111245218"/>
           <w:tag w:val="goog_rdk_129"/>
         </w:sdtPr>
         <w:sdtContent>
@@ -9112,7 +11010,7 @@
       </w:pPr>
       <w:sdt>
         <w:sdtPr>
-          <w:id w:val="1770830715"/>
+          <w:id w:val="-476606508"/>
           <w:tag w:val="goog_rdk_130"/>
         </w:sdtPr>
         <w:sdtContent>
@@ -9202,7 +11100,7 @@
       </w:pPr>
       <w:sdt>
         <w:sdtPr>
-          <w:id w:val="460827422"/>
+          <w:id w:val="-827587850"/>
           <w:tag w:val="goog_rdk_131"/>
         </w:sdtPr>
         <w:sdtContent>
@@ -9256,7 +11154,7 @@
       </w:pPr>
       <w:sdt>
         <w:sdtPr>
-          <w:id w:val="348105689"/>
+          <w:id w:val="-1886580938"/>
           <w:tag w:val="goog_rdk_132"/>
         </w:sdtPr>
         <w:sdtContent>
@@ -9287,7 +11185,7 @@
       </w:pPr>
       <w:sdt>
         <w:sdtPr>
-          <w:id w:val="1684701113"/>
+          <w:id w:val="1179446360"/>
           <w:tag w:val="goog_rdk_133"/>
         </w:sdtPr>
         <w:sdtContent>
@@ -9318,7 +11216,7 @@
       </w:pPr>
       <w:sdt>
         <w:sdtPr>
-          <w:id w:val="636635844"/>
+          <w:id w:val="-1927709739"/>
           <w:tag w:val="goog_rdk_134"/>
         </w:sdtPr>
         <w:sdtContent>
@@ -9385,7 +11283,7 @@
       </w:pPr>
       <w:sdt>
         <w:sdtPr>
-          <w:id w:val="1748134339"/>
+          <w:id w:val="596008592"/>
           <w:tag w:val="goog_rdk_135"/>
         </w:sdtPr>
         <w:sdtContent>
@@ -9452,7 +11350,7 @@
       </w:pPr>
       <w:sdt>
         <w:sdtPr>
-          <w:id w:val="-144762993"/>
+          <w:id w:val="1453774108"/>
           <w:tag w:val="goog_rdk_136"/>
         </w:sdtPr>
         <w:sdtContent>
@@ -9548,7 +11446,7 @@
             </w:r>
             <w:sdt>
               <w:sdtPr>
-                <w:id w:val="217546351"/>
+                <w:id w:val="1368926559"/>
                 <w:tag w:val="goog_rdk_137"/>
               </w:sdtPr>
               <w:sdtContent>
@@ -9592,7 +11490,7 @@
       </w:pPr>
       <w:sdt>
         <w:sdtPr>
-          <w:id w:val="-319751774"/>
+          <w:id w:val="-1843324592"/>
           <w:tag w:val="goog_rdk_138"/>
         </w:sdtPr>
         <w:sdtContent>
@@ -9623,7 +11521,7 @@
       </w:pPr>
       <w:sdt>
         <w:sdtPr>
-          <w:id w:val="-1415395332"/>
+          <w:id w:val="-1961023555"/>
           <w:tag w:val="goog_rdk_139"/>
         </w:sdtPr>
         <w:sdtContent>
@@ -9681,7 +11579,7 @@
       </w:pPr>
       <w:sdt>
         <w:sdtPr>
-          <w:id w:val="-1234878583"/>
+          <w:id w:val="-1793542647"/>
           <w:tag w:val="goog_rdk_140"/>
         </w:sdtPr>
         <w:sdtContent>
@@ -9737,7 +11635,7 @@
       </w:pPr>
       <w:sdt>
         <w:sdtPr>
-          <w:id w:val="-2126032000"/>
+          <w:id w:val="-32298943"/>
           <w:tag w:val="goog_rdk_141"/>
         </w:sdtPr>
         <w:sdtContent>
@@ -9793,7 +11691,7 @@
       </w:pPr>
       <w:sdt>
         <w:sdtPr>
-          <w:id w:val="-412357658"/>
+          <w:id w:val="1888796992"/>
           <w:tag w:val="goog_rdk_142"/>
         </w:sdtPr>
         <w:sdtContent>
@@ -9849,7 +11747,7 @@
       </w:pPr>
       <w:sdt>
         <w:sdtPr>
-          <w:id w:val="-1394092096"/>
+          <w:id w:val="-1932625519"/>
           <w:tag w:val="goog_rdk_143"/>
         </w:sdtPr>
         <w:sdtContent>
@@ -9905,7 +11803,7 @@
       </w:pPr>
       <w:sdt>
         <w:sdtPr>
-          <w:id w:val="-676006466"/>
+          <w:id w:val="1709260352"/>
           <w:tag w:val="goog_rdk_144"/>
         </w:sdtPr>
         <w:sdtContent>
@@ -9998,7 +11896,7 @@
             </w:pPr>
             <w:sdt>
               <w:sdtPr>
-                <w:id w:val="-958253330"/>
+                <w:id w:val="-1899431757"/>
                 <w:tag w:val="goog_rdk_145"/>
               </w:sdtPr>
               <w:sdtContent>
@@ -10018,7 +11916,7 @@
             </w:sdt>
             <w:sdt>
               <w:sdtPr>
-                <w:id w:val="-1700831897"/>
+                <w:id w:val="-1213860902"/>
                 <w:tag w:val="goog_rdk_146"/>
               </w:sdtPr>
               <w:sdtContent>
@@ -10062,7 +11960,7 @@
       </w:pPr>
       <w:sdt>
         <w:sdtPr>
-          <w:id w:val="-736468928"/>
+          <w:id w:val="1490472405"/>
           <w:tag w:val="goog_rdk_147"/>
         </w:sdtPr>
         <w:sdtContent>
@@ -10094,7 +11992,7 @@
       </w:pPr>
       <w:sdt>
         <w:sdtPr>
-          <w:id w:val="707345924"/>
+          <w:id w:val="341218694"/>
           <w:tag w:val="goog_rdk_148"/>
         </w:sdtPr>
         <w:sdtContent>
@@ -10125,7 +12023,7 @@
       </w:pPr>
       <w:sdt>
         <w:sdtPr>
-          <w:id w:val="-1601021621"/>
+          <w:id w:val="-1068944013"/>
           <w:tag w:val="goog_rdk_149"/>
         </w:sdtPr>
         <w:sdtContent>
@@ -10166,7 +12064,7 @@
       </w:pPr>
       <w:sdt>
         <w:sdtPr>
-          <w:id w:val="-653378835"/>
+          <w:id w:val="-1865071180"/>
           <w:tag w:val="goog_rdk_150"/>
         </w:sdtPr>
         <w:sdtContent>
@@ -10199,7 +12097,7 @@
       </w:pPr>
       <w:sdt>
         <w:sdtPr>
-          <w:id w:val="1941268934"/>
+          <w:id w:val="-769000593"/>
           <w:tag w:val="goog_rdk_151"/>
         </w:sdtPr>
         <w:sdtContent>
@@ -10243,7 +12141,7 @@
       </w:pPr>
       <w:sdt>
         <w:sdtPr>
-          <w:id w:val="-1493962798"/>
+          <w:id w:val="-802376775"/>
           <w:tag w:val="goog_rdk_152"/>
         </w:sdtPr>
         <w:sdtContent>
@@ -10274,7 +12172,7 @@
       </w:pPr>
       <w:sdt>
         <w:sdtPr>
-          <w:id w:val="-528959211"/>
+          <w:id w:val="-1925149276"/>
           <w:tag w:val="goog_rdk_153"/>
         </w:sdtPr>
         <w:sdtContent>
@@ -10305,7 +12203,7 @@
       </w:pPr>
       <w:sdt>
         <w:sdtPr>
-          <w:id w:val="-312850078"/>
+          <w:id w:val="-2015929604"/>
           <w:tag w:val="goog_rdk_154"/>
         </w:sdtPr>
         <w:sdtContent>
@@ -10336,7 +12234,7 @@
       </w:pPr>
       <w:sdt>
         <w:sdtPr>
-          <w:id w:val="-53225096"/>
+          <w:id w:val="758892308"/>
           <w:tag w:val="goog_rdk_155"/>
         </w:sdtPr>
         <w:sdtContent>
@@ -10367,7 +12265,7 @@
       </w:pPr>
       <w:sdt>
         <w:sdtPr>
-          <w:id w:val="-151001952"/>
+          <w:id w:val="-748837548"/>
           <w:tag w:val="goog_rdk_156"/>
         </w:sdtPr>
         <w:sdtContent>
@@ -10398,7 +12296,7 @@
       </w:pPr>
       <w:sdt>
         <w:sdtPr>
-          <w:id w:val="590874220"/>
+          <w:id w:val="2104089604"/>
           <w:tag w:val="goog_rdk_157"/>
         </w:sdtPr>
         <w:sdtContent>
@@ -10439,7 +12337,7 @@
       </w:pPr>
       <w:sdt>
         <w:sdtPr>
-          <w:id w:val="-1144463434"/>
+          <w:id w:val="-2039679513"/>
           <w:tag w:val="goog_rdk_158"/>
         </w:sdtPr>
         <w:sdtContent>
@@ -10472,7 +12370,7 @@
       </w:pPr>
       <w:sdt>
         <w:sdtPr>
-          <w:id w:val="500506249"/>
+          <w:id w:val="1545209080"/>
           <w:tag w:val="goog_rdk_159"/>
         </w:sdtPr>
         <w:sdtContent>
@@ -10503,7 +12401,7 @@
       </w:pPr>
       <w:sdt>
         <w:sdtPr>
-          <w:id w:val="590920245"/>
+          <w:id w:val="-299507458"/>
           <w:tag w:val="goog_rdk_160"/>
         </w:sdtPr>
         <w:sdtContent>
@@ -10534,7 +12432,7 @@
       </w:pPr>
       <w:sdt>
         <w:sdtPr>
-          <w:id w:val="451385029"/>
+          <w:id w:val="-1688612430"/>
           <w:tag w:val="goog_rdk_161"/>
         </w:sdtPr>
         <w:sdtContent>
@@ -10575,7 +12473,7 @@
       </w:pPr>
       <w:sdt>
         <w:sdtPr>
-          <w:id w:val="-1384763866"/>
+          <w:id w:val="-914353624"/>
           <w:tag w:val="goog_rdk_162"/>
         </w:sdtPr>
         <w:sdtContent>
@@ -10608,7 +12506,7 @@
       </w:pPr>
       <w:sdt>
         <w:sdtPr>
-          <w:id w:val="1799024456"/>
+          <w:id w:val="1786398544"/>
           <w:tag w:val="goog_rdk_163"/>
         </w:sdtPr>
         <w:sdtContent>
@@ -10639,7 +12537,7 @@
       </w:pPr>
       <w:sdt>
         <w:sdtPr>
-          <w:id w:val="819601890"/>
+          <w:id w:val="25602499"/>
           <w:tag w:val="goog_rdk_164"/>
         </w:sdtPr>
         <w:sdtContent>
@@ -10670,7 +12568,7 @@
       </w:pPr>
       <w:sdt>
         <w:sdtPr>
-          <w:id w:val="-188716080"/>
+          <w:id w:val="2078747472"/>
           <w:tag w:val="goog_rdk_165"/>
         </w:sdtPr>
         <w:sdtContent>
@@ -10701,7 +12599,7 @@
       </w:pPr>
       <w:sdt>
         <w:sdtPr>
-          <w:id w:val="-696707014"/>
+          <w:id w:val="756551770"/>
           <w:tag w:val="goog_rdk_166"/>
         </w:sdtPr>
         <w:sdtContent>
@@ -10745,7 +12643,7 @@
       </w:pPr>
       <w:sdt>
         <w:sdtPr>
-          <w:id w:val="-1697508057"/>
+          <w:id w:val="-560127794"/>
           <w:tag w:val="goog_rdk_167"/>
         </w:sdtPr>
         <w:sdtContent>
@@ -10776,7 +12674,7 @@
       </w:pPr>
       <w:sdt>
         <w:sdtPr>
-          <w:id w:val="-1389837722"/>
+          <w:id w:val="-855603589"/>
           <w:tag w:val="goog_rdk_168"/>
         </w:sdtPr>
         <w:sdtContent>
@@ -10807,7 +12705,7 @@
       </w:pPr>
       <w:sdt>
         <w:sdtPr>
-          <w:id w:val="280380843"/>
+          <w:id w:val="-1741587213"/>
           <w:tag w:val="goog_rdk_169"/>
         </w:sdtPr>
         <w:sdtContent>
@@ -10838,7 +12736,7 @@
       </w:pPr>
       <w:sdt>
         <w:sdtPr>
-          <w:id w:val="-294020321"/>
+          <w:id w:val="-1929972523"/>
           <w:tag w:val="goog_rdk_170"/>
         </w:sdtPr>
         <w:sdtContent>
@@ -10869,7 +12767,7 @@
       </w:pPr>
       <w:sdt>
         <w:sdtPr>
-          <w:id w:val="-1988605923"/>
+          <w:id w:val="774435904"/>
           <w:tag w:val="goog_rdk_171"/>
         </w:sdtPr>
         <w:sdtContent>
@@ -10900,7 +12798,7 @@
       </w:pPr>
       <w:sdt>
         <w:sdtPr>
-          <w:id w:val="1983293266"/>
+          <w:id w:val="-1736981707"/>
           <w:tag w:val="goog_rdk_172"/>
         </w:sdtPr>
         <w:sdtContent>
@@ -10984,7 +12882,7 @@
             </w:pPr>
             <w:sdt>
               <w:sdtPr>
-                <w:id w:val="913229808"/>
+                <w:id w:val="-1719105483"/>
                 <w:tag w:val="goog_rdk_173"/>
               </w:sdtPr>
               <w:sdtContent>
@@ -11004,7 +12902,7 @@
             </w:sdt>
             <w:sdt>
               <w:sdtPr>
-                <w:id w:val="1635502212"/>
+                <w:id w:val="535933582"/>
                 <w:tag w:val="goog_rdk_174"/>
               </w:sdtPr>
               <w:sdtContent>
@@ -11048,7 +12946,7 @@
       </w:pPr>
       <w:sdt>
         <w:sdtPr>
-          <w:id w:val="1007754376"/>
+          <w:id w:val="1482577031"/>
           <w:tag w:val="goog_rdk_175"/>
         </w:sdtPr>
         <w:sdtContent>
@@ -11081,7 +12979,7 @@
       </w:pPr>
       <w:sdt>
         <w:sdtPr>
-          <w:id w:val="1620394329"/>
+          <w:id w:val="-1351284587"/>
           <w:tag w:val="goog_rdk_176"/>
         </w:sdtPr>
         <w:sdtContent>
@@ -11112,7 +13010,7 @@
       </w:pPr>
       <w:sdt>
         <w:sdtPr>
-          <w:id w:val="-1354191054"/>
+          <w:id w:val="481699265"/>
           <w:tag w:val="goog_rdk_177"/>
         </w:sdtPr>
         <w:sdtContent>
@@ -11143,7 +13041,7 @@
       </w:pPr>
       <w:sdt>
         <w:sdtPr>
-          <w:id w:val="-186561083"/>
+          <w:id w:val="-1537898503"/>
           <w:tag w:val="goog_rdk_178"/>
         </w:sdtPr>
         <w:sdtContent>
@@ -11174,7 +13072,7 @@
       </w:pPr>
       <w:sdt>
         <w:sdtPr>
-          <w:id w:val="-864288736"/>
+          <w:id w:val="-1052248494"/>
           <w:tag w:val="goog_rdk_179"/>
         </w:sdtPr>
         <w:sdtContent>
@@ -11215,7 +13113,7 @@
       </w:pPr>
       <w:sdt>
         <w:sdtPr>
-          <w:id w:val="-1273563126"/>
+          <w:id w:val="1463025208"/>
           <w:tag w:val="goog_rdk_180"/>
         </w:sdtPr>
         <w:sdtContent>
@@ -11248,15 +13146,15 @@
       <w:r>
         <w:rPr/>
         <w:drawing>
-          <wp:inline distB="0" distT="0" distL="0" distR="0">
-            <wp:extent cx="5524500" cy="3238500"/>
+          <wp:inline distB="114300" distT="114300" distL="114300" distR="114300">
+            <wp:extent cx="6188400" cy="2501900"/>
             <wp:effectExtent b="0" l="0" r="0" t="0"/>
-            <wp:docPr id="3" name="image2.jpg"/>
+            <wp:docPr id="3" name="image3.png"/>
             <a:graphic>
               <a:graphicData uri="http://schemas.openxmlformats.org/drawingml/2006/picture">
                 <pic:pic>
                   <pic:nvPicPr>
-                    <pic:cNvPr id="0" name="image2.jpg"/>
+                    <pic:cNvPr id="0" name="image3.png"/>
                     <pic:cNvPicPr preferRelativeResize="0"/>
                   </pic:nvPicPr>
                   <pic:blipFill>
@@ -11269,7 +13167,7 @@
                   <pic:spPr>
                     <a:xfrm>
                       <a:off x="0" y="0"/>
-                      <a:ext cx="5524500" cy="3238500"/>
+                      <a:ext cx="6188400" cy="2501900"/>
                     </a:xfrm>
                     <a:prstGeom prst="rect"/>
                     <a:ln/>
@@ -11294,7 +13192,7 @@
       </w:pPr>
       <w:sdt>
         <w:sdtPr>
-          <w:id w:val="828707863"/>
+          <w:id w:val="-529744422"/>
           <w:tag w:val="goog_rdk_181"/>
         </w:sdtPr>
         <w:sdtContent>
@@ -11342,7 +13240,7 @@
       </w:pPr>
       <w:sdt>
         <w:sdtPr>
-          <w:id w:val="987991030"/>
+          <w:id w:val="-336827680"/>
           <w:tag w:val="goog_rdk_182"/>
         </w:sdtPr>
         <w:sdtContent>
@@ -11373,7 +13271,7 @@
       </w:pPr>
       <w:sdt>
         <w:sdtPr>
-          <w:id w:val="-1147321208"/>
+          <w:id w:val="2076716902"/>
           <w:tag w:val="goog_rdk_183"/>
         </w:sdtPr>
         <w:sdtContent>
@@ -11539,7 +13437,7 @@
             </w:pPr>
             <w:sdt>
               <w:sdtPr>
-                <w:id w:val="-603829871"/>
+                <w:id w:val="-449707961"/>
                 <w:tag w:val="goog_rdk_184"/>
               </w:sdtPr>
               <w:sdtContent>
@@ -12287,7 +14185,7 @@
       </w:pPr>
       <w:sdt>
         <w:sdtPr>
-          <w:id w:val="1407500616"/>
+          <w:id w:val="1222398072"/>
           <w:tag w:val="goog_rdk_185"/>
         </w:sdtPr>
         <w:sdtContent>
@@ -12366,7 +14264,7 @@
             </w:pPr>
             <w:sdt>
               <w:sdtPr>
-                <w:id w:val="1426604466"/>
+                <w:id w:val="-697137426"/>
                 <w:tag w:val="goog_rdk_186"/>
               </w:sdtPr>
               <w:sdtContent>
@@ -12413,7 +14311,7 @@
             </w:pPr>
             <w:sdt>
               <w:sdtPr>
-                <w:id w:val="1909210582"/>
+                <w:id w:val="1252395013"/>
                 <w:tag w:val="goog_rdk_187"/>
               </w:sdtPr>
               <w:sdtContent>
@@ -12460,7 +14358,7 @@
             </w:pPr>
             <w:sdt>
               <w:sdtPr>
-                <w:id w:val="291011243"/>
+                <w:id w:val="-533797918"/>
                 <w:tag w:val="goog_rdk_188"/>
               </w:sdtPr>
               <w:sdtContent>
@@ -12587,7 +14485,7 @@
             </w:pPr>
             <w:sdt>
               <w:sdtPr>
-                <w:id w:val="1489737374"/>
+                <w:id w:val="-1599074837"/>
                 <w:tag w:val="goog_rdk_189"/>
               </w:sdtPr>
               <w:sdtContent>
@@ -12712,7 +14610,7 @@
             </w:pPr>
             <w:sdt>
               <w:sdtPr>
-                <w:id w:val="1414709983"/>
+                <w:id w:val="294569927"/>
                 <w:tag w:val="goog_rdk_190"/>
               </w:sdtPr>
               <w:sdtContent>
@@ -12837,7 +14735,7 @@
             </w:pPr>
             <w:sdt>
               <w:sdtPr>
-                <w:id w:val="-818385679"/>
+                <w:id w:val="-1023681825"/>
                 <w:tag w:val="goog_rdk_191"/>
               </w:sdtPr>
               <w:sdtContent>
@@ -12962,7 +14860,7 @@
             </w:pPr>
             <w:sdt>
               <w:sdtPr>
-                <w:id w:val="940693464"/>
+                <w:id w:val="-1580086558"/>
                 <w:tag w:val="goog_rdk_192"/>
               </w:sdtPr>
               <w:sdtContent>
@@ -13022,7 +14920,7 @@
       </w:pPr>
       <w:sdt>
         <w:sdtPr>
-          <w:id w:val="1966866061"/>
+          <w:id w:val="-2047443052"/>
           <w:tag w:val="goog_rdk_193"/>
         </w:sdtPr>
         <w:sdtContent>
@@ -13054,7 +14952,7 @@
       </w:pPr>
       <w:sdt>
         <w:sdtPr>
-          <w:id w:val="-600588066"/>
+          <w:id w:val="94402316"/>
           <w:tag w:val="goog_rdk_194"/>
         </w:sdtPr>
         <w:sdtContent>
@@ -13085,7 +14983,7 @@
       </w:pPr>
       <w:sdt>
         <w:sdtPr>
-          <w:id w:val="-1911046587"/>
+          <w:id w:val="615089651"/>
           <w:tag w:val="goog_rdk_195"/>
         </w:sdtPr>
         <w:sdtContent>
@@ -13171,7 +15069,7 @@
             </w:pPr>
             <w:sdt>
               <w:sdtPr>
-                <w:id w:val="-1569618368"/>
+                <w:id w:val="-1016854264"/>
                 <w:tag w:val="goog_rdk_196"/>
               </w:sdtPr>
               <w:sdtContent>
@@ -13218,7 +15116,7 @@
             </w:pPr>
             <w:sdt>
               <w:sdtPr>
-                <w:id w:val="1694265816"/>
+                <w:id w:val="2142650377"/>
                 <w:tag w:val="goog_rdk_197"/>
               </w:sdtPr>
               <w:sdtContent>
@@ -13308,7 +15206,7 @@
             </w:pPr>
             <w:sdt>
               <w:sdtPr>
-                <w:id w:val="-1954962416"/>
+                <w:id w:val="787736609"/>
                 <w:tag w:val="goog_rdk_198"/>
               </w:sdtPr>
               <w:sdtContent>
@@ -13396,7 +15294,7 @@
             </w:pPr>
             <w:sdt>
               <w:sdtPr>
-                <w:id w:val="-525347490"/>
+                <w:id w:val="-1347671356"/>
                 <w:tag w:val="goog_rdk_199"/>
               </w:sdtPr>
               <w:sdtContent>
@@ -13447,7 +15345,7 @@
             </w:pPr>
             <w:sdt>
               <w:sdtPr>
-                <w:id w:val="-271391993"/>
+                <w:id w:val="-1135339229"/>
                 <w:tag w:val="goog_rdk_200"/>
               </w:sdtPr>
               <w:sdtContent>
@@ -13492,7 +15390,7 @@
             </w:pPr>
             <w:sdt>
               <w:sdtPr>
-                <w:id w:val="41487710"/>
+                <w:id w:val="-818854793"/>
                 <w:tag w:val="goog_rdk_201"/>
               </w:sdtPr>
               <w:sdtContent>
@@ -13580,7 +15478,7 @@
             </w:pPr>
             <w:sdt>
               <w:sdtPr>
-                <w:id w:val="348353437"/>
+                <w:id w:val="-1020250901"/>
                 <w:tag w:val="goog_rdk_202"/>
               </w:sdtPr>
               <w:sdtContent>
@@ -13668,7 +15566,7 @@
             </w:pPr>
             <w:sdt>
               <w:sdtPr>
-                <w:id w:val="629958744"/>
+                <w:id w:val="2004713338"/>
                 <w:tag w:val="goog_rdk_203"/>
               </w:sdtPr>
               <w:sdtContent>
@@ -13712,7 +15610,7 @@
       </w:pPr>
       <w:sdt>
         <w:sdtPr>
-          <w:id w:val="-963480219"/>
+          <w:id w:val="2104663956"/>
           <w:tag w:val="goog_rdk_204"/>
         </w:sdtPr>
         <w:sdtContent>
@@ -13743,7 +15641,7 @@
       </w:pPr>
       <w:sdt>
         <w:sdtPr>
-          <w:id w:val="-793561925"/>
+          <w:id w:val="773370579"/>
           <w:tag w:val="goog_rdk_205"/>
         </w:sdtPr>
         <w:sdtContent>
@@ -13785,7 +15683,7 @@
       </w:pPr>
       <w:sdt>
         <w:sdtPr>
-          <w:id w:val="-566735438"/>
+          <w:id w:val="-351270257"/>
           <w:tag w:val="goog_rdk_206"/>
         </w:sdtPr>
         <w:sdtContent>
@@ -13921,7 +15819,7 @@
       </w:pPr>
       <w:sdt>
         <w:sdtPr>
-          <w:id w:val="-998986226"/>
+          <w:id w:val="-136532565"/>
           <w:tag w:val="goog_rdk_207"/>
         </w:sdtPr>
         <w:sdtContent>
@@ -13988,7 +15886,7 @@
       </w:pPr>
       <w:sdt>
         <w:sdtPr>
-          <w:id w:val="-1158386417"/>
+          <w:id w:val="-2145681182"/>
           <w:tag w:val="goog_rdk_208"/>
         </w:sdtPr>
         <w:sdtContent>
@@ -14091,7 +15989,7 @@
       </w:pPr>
       <w:sdt>
         <w:sdtPr>
-          <w:id w:val="-523155363"/>
+          <w:id w:val="1362316692"/>
           <w:tag w:val="goog_rdk_209"/>
         </w:sdtPr>
         <w:sdtContent>
@@ -14123,7 +16021,7 @@
       </w:pPr>
       <w:sdt>
         <w:sdtPr>
-          <w:id w:val="1988456490"/>
+          <w:id w:val="146245011"/>
           <w:tag w:val="goog_rdk_210"/>
         </w:sdtPr>
         <w:sdtContent>
@@ -14172,7 +16070,7 @@
       </w:pPr>
       <w:sdt>
         <w:sdtPr>
-          <w:id w:val="1190255049"/>
+          <w:id w:val="-123550419"/>
           <w:tag w:val="goog_rdk_211"/>
         </w:sdtPr>
         <w:sdtContent>
@@ -14228,7 +16126,7 @@
       </w:pPr>
       <w:sdt>
         <w:sdtPr>
-          <w:id w:val="1328198886"/>
+          <w:id w:val="-1262680811"/>
           <w:tag w:val="goog_rdk_212"/>
         </w:sdtPr>
         <w:sdtContent>
@@ -14284,7 +16182,7 @@
       </w:pPr>
       <w:sdt>
         <w:sdtPr>
-          <w:id w:val="1094740473"/>
+          <w:id w:val="-1254594015"/>
           <w:tag w:val="goog_rdk_213"/>
         </w:sdtPr>
         <w:sdtContent>
@@ -14340,7 +16238,7 @@
       </w:pPr>
       <w:sdt>
         <w:sdtPr>
-          <w:id w:val="728027719"/>
+          <w:id w:val="2067340933"/>
           <w:tag w:val="goog_rdk_214"/>
         </w:sdtPr>
         <w:sdtContent>
@@ -14396,7 +16294,7 @@
       </w:pPr>
       <w:sdt>
         <w:sdtPr>
-          <w:id w:val="-2022135851"/>
+          <w:id w:val="-1601914031"/>
           <w:tag w:val="goog_rdk_215"/>
         </w:sdtPr>
         <w:sdtContent>
@@ -14452,7 +16350,7 @@
       </w:pPr>
       <w:sdt>
         <w:sdtPr>
-          <w:id w:val="-1696820917"/>
+          <w:id w:val="-126940134"/>
           <w:tag w:val="goog_rdk_216"/>
         </w:sdtPr>
         <w:sdtContent>
@@ -14502,7 +16400,7 @@
       </w:pPr>
       <w:sdt>
         <w:sdtPr>
-          <w:id w:val="815419151"/>
+          <w:id w:val="1910602101"/>
           <w:tag w:val="goog_rdk_217"/>
         </w:sdtPr>
         <w:sdtContent>
@@ -14533,7 +16431,7 @@
       </w:pPr>
       <w:sdt>
         <w:sdtPr>
-          <w:id w:val="-1808905386"/>
+          <w:id w:val="270247581"/>
           <w:tag w:val="goog_rdk_218"/>
         </w:sdtPr>
         <w:sdtContent>
@@ -14621,7 +16519,7 @@
             </w:pPr>
             <w:sdt>
               <w:sdtPr>
-                <w:id w:val="1653078451"/>
+                <w:id w:val="-253428947"/>
                 <w:tag w:val="goog_rdk_219"/>
               </w:sdtPr>
               <w:sdtContent>
@@ -14668,7 +16566,7 @@
             </w:pPr>
             <w:sdt>
               <w:sdtPr>
-                <w:id w:val="-758000871"/>
+                <w:id w:val="1032606403"/>
                 <w:tag w:val="goog_rdk_220"/>
               </w:sdtPr>
               <w:sdtContent>
@@ -14715,7 +16613,7 @@
             </w:pPr>
             <w:sdt>
               <w:sdtPr>
-                <w:id w:val="-1564399490"/>
+                <w:id w:val="-1921769290"/>
                 <w:tag w:val="goog_rdk_221"/>
               </w:sdtPr>
               <w:sdtContent>
@@ -14805,7 +16703,7 @@
             </w:pPr>
             <w:sdt>
               <w:sdtPr>
-                <w:id w:val="-248165271"/>
+                <w:id w:val="-604810360"/>
                 <w:tag w:val="goog_rdk_222"/>
               </w:sdtPr>
               <w:sdtContent>
@@ -14850,7 +16748,7 @@
             </w:pPr>
             <w:sdt>
               <w:sdtPr>
-                <w:id w:val="-1387363537"/>
+                <w:id w:val="1192658607"/>
                 <w:tag w:val="goog_rdk_223"/>
               </w:sdtPr>
               <w:sdtContent>
@@ -14938,7 +16836,7 @@
             </w:pPr>
             <w:sdt>
               <w:sdtPr>
-                <w:id w:val="-1683778149"/>
+                <w:id w:val="1602209905"/>
                 <w:tag w:val="goog_rdk_224"/>
               </w:sdtPr>
               <w:sdtContent>
@@ -14983,7 +16881,7 @@
             </w:pPr>
             <w:sdt>
               <w:sdtPr>
-                <w:id w:val="1122210933"/>
+                <w:id w:val="-1857625451"/>
                 <w:tag w:val="goog_rdk_225"/>
               </w:sdtPr>
               <w:sdtContent>
@@ -15027,7 +16925,7 @@
       </w:pPr>
       <w:sdt>
         <w:sdtPr>
-          <w:id w:val="-688576512"/>
+          <w:id w:val="-2090869419"/>
           <w:tag w:val="goog_rdk_226"/>
         </w:sdtPr>
         <w:sdtContent>
@@ -15058,7 +16956,7 @@
       </w:pPr>
       <w:sdt>
         <w:sdtPr>
-          <w:id w:val="1437173328"/>
+          <w:id w:val="-374102316"/>
           <w:tag w:val="goog_rdk_227"/>
         </w:sdtPr>
         <w:sdtContent>
@@ -15115,7 +17013,7 @@
       </w:pPr>
       <w:sdt>
         <w:sdtPr>
-          <w:id w:val="-862678752"/>
+          <w:id w:val="-1372065801"/>
           <w:tag w:val="goog_rdk_228"/>
         </w:sdtPr>
         <w:sdtContent>
@@ -15147,7 +17045,7 @@
       </w:pPr>
       <w:sdt>
         <w:sdtPr>
-          <w:id w:val="22717382"/>
+          <w:id w:val="-301836495"/>
           <w:tag w:val="goog_rdk_229"/>
         </w:sdtPr>
         <w:sdtContent>
@@ -15226,7 +17124,7 @@
             </w:pPr>
             <w:sdt>
               <w:sdtPr>
-                <w:id w:val="-1169298435"/>
+                <w:id w:val="369207639"/>
                 <w:tag w:val="goog_rdk_230"/>
               </w:sdtPr>
               <w:sdtContent>
@@ -15273,7 +17171,7 @@
             </w:pPr>
             <w:sdt>
               <w:sdtPr>
-                <w:id w:val="2005836005"/>
+                <w:id w:val="451554444"/>
                 <w:tag w:val="goog_rdk_231"/>
               </w:sdtPr>
               <w:sdtContent>
@@ -15320,7 +17218,7 @@
             </w:pPr>
             <w:sdt>
               <w:sdtPr>
-                <w:id w:val="166918696"/>
+                <w:id w:val="-1712170955"/>
                 <w:tag w:val="goog_rdk_232"/>
               </w:sdtPr>
               <w:sdtContent>
@@ -15373,7 +17271,7 @@
             </w:pPr>
             <w:sdt>
               <w:sdtPr>
-                <w:id w:val="1754525605"/>
+                <w:id w:val="346092458"/>
                 <w:tag w:val="goog_rdk_233"/>
               </w:sdtPr>
               <w:sdtContent>
@@ -15418,7 +17316,7 @@
             </w:pPr>
             <w:sdt>
               <w:sdtPr>
-                <w:id w:val="-1722562677"/>
+                <w:id w:val="2100823968"/>
                 <w:tag w:val="goog_rdk_234"/>
               </w:sdtPr>
               <w:sdtContent>
@@ -15463,7 +17361,7 @@
             </w:pPr>
             <w:sdt>
               <w:sdtPr>
-                <w:id w:val="-466442404"/>
+                <w:id w:val="-1562427200"/>
                 <w:tag w:val="goog_rdk_235"/>
               </w:sdtPr>
               <w:sdtContent>
@@ -15514,7 +17412,7 @@
             </w:pPr>
             <w:sdt>
               <w:sdtPr>
-                <w:id w:val="1755705982"/>
+                <w:id w:val="-1940841003"/>
                 <w:tag w:val="goog_rdk_236"/>
               </w:sdtPr>
               <w:sdtContent>
@@ -15559,7 +17457,7 @@
             </w:pPr>
             <w:sdt>
               <w:sdtPr>
-                <w:id w:val="1752808431"/>
+                <w:id w:val="124740739"/>
                 <w:tag w:val="goog_rdk_237"/>
               </w:sdtPr>
               <w:sdtContent>
@@ -15604,7 +17502,7 @@
             </w:pPr>
             <w:sdt>
               <w:sdtPr>
-                <w:id w:val="712181501"/>
+                <w:id w:val="683311013"/>
                 <w:tag w:val="goog_rdk_238"/>
               </w:sdtPr>
               <w:sdtContent>
@@ -15655,7 +17553,7 @@
             </w:pPr>
             <w:sdt>
               <w:sdtPr>
-                <w:id w:val="260018764"/>
+                <w:id w:val="1200407670"/>
                 <w:tag w:val="goog_rdk_239"/>
               </w:sdtPr>
               <w:sdtContent>
@@ -15700,7 +17598,7 @@
             </w:pPr>
             <w:sdt>
               <w:sdtPr>
-                <w:id w:val="516458867"/>
+                <w:id w:val="-403930649"/>
                 <w:tag w:val="goog_rdk_240"/>
               </w:sdtPr>
               <w:sdtContent>
@@ -15745,7 +17643,7 @@
             </w:pPr>
             <w:sdt>
               <w:sdtPr>
-                <w:id w:val="67841318"/>
+                <w:id w:val="-1936755515"/>
                 <w:tag w:val="goog_rdk_241"/>
               </w:sdtPr>
               <w:sdtContent>
@@ -15796,7 +17694,7 @@
             </w:pPr>
             <w:sdt>
               <w:sdtPr>
-                <w:id w:val="-1310025466"/>
+                <w:id w:val="325004265"/>
                 <w:tag w:val="goog_rdk_242"/>
               </w:sdtPr>
               <w:sdtContent>
@@ -15841,7 +17739,7 @@
             </w:pPr>
             <w:sdt>
               <w:sdtPr>
-                <w:id w:val="-1733592150"/>
+                <w:id w:val="834290302"/>
                 <w:tag w:val="goog_rdk_243"/>
               </w:sdtPr>
               <w:sdtContent>
@@ -15886,7 +17784,7 @@
             </w:pPr>
             <w:sdt>
               <w:sdtPr>
-                <w:id w:val="527715452"/>
+                <w:id w:val="1540525084"/>
                 <w:tag w:val="goog_rdk_244"/>
               </w:sdtPr>
               <w:sdtContent>
@@ -15937,7 +17835,7 @@
             </w:pPr>
             <w:sdt>
               <w:sdtPr>
-                <w:id w:val="1360432263"/>
+                <w:id w:val="431982243"/>
                 <w:tag w:val="goog_rdk_245"/>
               </w:sdtPr>
               <w:sdtContent>
@@ -15982,7 +17880,7 @@
             </w:pPr>
             <w:sdt>
               <w:sdtPr>
-                <w:id w:val="-606131692"/>
+                <w:id w:val="1923098335"/>
                 <w:tag w:val="goog_rdk_246"/>
               </w:sdtPr>
               <w:sdtContent>
@@ -16027,7 +17925,7 @@
             </w:pPr>
             <w:sdt>
               <w:sdtPr>
-                <w:id w:val="-1425888961"/>
+                <w:id w:val="-789352670"/>
                 <w:tag w:val="goog_rdk_247"/>
               </w:sdtPr>
               <w:sdtContent>
@@ -16078,7 +17976,7 @@
             </w:pPr>
             <w:sdt>
               <w:sdtPr>
-                <w:id w:val="1646094209"/>
+                <w:id w:val="883343522"/>
                 <w:tag w:val="goog_rdk_248"/>
               </w:sdtPr>
               <w:sdtContent>
@@ -16123,7 +18021,7 @@
             </w:pPr>
             <w:sdt>
               <w:sdtPr>
-                <w:id w:val="-2042127227"/>
+                <w:id w:val="124296210"/>
                 <w:tag w:val="goog_rdk_249"/>
               </w:sdtPr>
               <w:sdtContent>
@@ -16168,7 +18066,7 @@
             </w:pPr>
             <w:sdt>
               <w:sdtPr>
-                <w:id w:val="-1081554295"/>
+                <w:id w:val="1672611866"/>
                 <w:tag w:val="goog_rdk_250"/>
               </w:sdtPr>
               <w:sdtContent>
@@ -16212,7 +18110,7 @@
       </w:pPr>
       <w:sdt>
         <w:sdtPr>
-          <w:id w:val="1144433425"/>
+          <w:id w:val="1788754147"/>
           <w:tag w:val="goog_rdk_251"/>
         </w:sdtPr>
         <w:sdtContent>
@@ -16261,7 +18159,7 @@
       </w:pPr>
       <w:sdt>
         <w:sdtPr>
-          <w:id w:val="-2145233260"/>
+          <w:id w:val="424928492"/>
           <w:tag w:val="goog_rdk_252"/>
         </w:sdtPr>
         <w:sdtContent>
@@ -16317,7 +18215,7 @@
       </w:pPr>
       <w:sdt>
         <w:sdtPr>
-          <w:id w:val="1744567786"/>
+          <w:id w:val="-1758138261"/>
           <w:tag w:val="goog_rdk_253"/>
         </w:sdtPr>
         <w:sdtContent>
@@ -16373,7 +18271,7 @@
       </w:pPr>
       <w:sdt>
         <w:sdtPr>
-          <w:id w:val="2117937267"/>
+          <w:id w:val="-1321373849"/>
           <w:tag w:val="goog_rdk_254"/>
         </w:sdtPr>
         <w:sdtContent>
@@ -16439,7 +18337,7 @@
       </w:pPr>
       <w:sdt>
         <w:sdtPr>
-          <w:id w:val="96765723"/>
+          <w:id w:val="580020413"/>
           <w:tag w:val="goog_rdk_255"/>
         </w:sdtPr>
         <w:sdtContent>
@@ -16518,7 +18416,7 @@
             </w:pPr>
             <w:sdt>
               <w:sdtPr>
-                <w:id w:val="1165042693"/>
+                <w:id w:val="-1384000653"/>
                 <w:tag w:val="goog_rdk_256"/>
               </w:sdtPr>
               <w:sdtContent>
@@ -16565,7 +18463,7 @@
             </w:pPr>
             <w:sdt>
               <w:sdtPr>
-                <w:id w:val="1083155044"/>
+                <w:id w:val="-525263131"/>
                 <w:tag w:val="goog_rdk_257"/>
               </w:sdtPr>
               <w:sdtContent>
@@ -16612,7 +18510,7 @@
             </w:pPr>
             <w:sdt>
               <w:sdtPr>
-                <w:id w:val="-950511649"/>
+                <w:id w:val="1561174774"/>
                 <w:tag w:val="goog_rdk_258"/>
               </w:sdtPr>
               <w:sdtContent>
@@ -16665,7 +18563,7 @@
             </w:pPr>
             <w:sdt>
               <w:sdtPr>
-                <w:id w:val="-1757153925"/>
+                <w:id w:val="-170601853"/>
                 <w:tag w:val="goog_rdk_259"/>
               </w:sdtPr>
               <w:sdtContent>
@@ -16710,7 +18608,7 @@
             </w:pPr>
             <w:sdt>
               <w:sdtPr>
-                <w:id w:val="-882623743"/>
+                <w:id w:val="-398368784"/>
                 <w:tag w:val="goog_rdk_260"/>
               </w:sdtPr>
               <w:sdtContent>
@@ -16755,7 +18653,7 @@
             </w:pPr>
             <w:sdt>
               <w:sdtPr>
-                <w:id w:val="-1257024483"/>
+                <w:id w:val="-994452435"/>
                 <w:tag w:val="goog_rdk_261"/>
               </w:sdtPr>
               <w:sdtContent>
@@ -16806,7 +18704,7 @@
             </w:pPr>
             <w:sdt>
               <w:sdtPr>
-                <w:id w:val="-398054662"/>
+                <w:id w:val="-247055839"/>
                 <w:tag w:val="goog_rdk_262"/>
               </w:sdtPr>
               <w:sdtContent>
@@ -16851,7 +18749,7 @@
             </w:pPr>
             <w:sdt>
               <w:sdtPr>
-                <w:id w:val="-944656940"/>
+                <w:id w:val="-765978991"/>
                 <w:tag w:val="goog_rdk_263"/>
               </w:sdtPr>
               <w:sdtContent>
@@ -16896,7 +18794,7 @@
             </w:pPr>
             <w:sdt>
               <w:sdtPr>
-                <w:id w:val="-1221015635"/>
+                <w:id w:val="-1985983171"/>
                 <w:tag w:val="goog_rdk_264"/>
               </w:sdtPr>
               <w:sdtContent>
@@ -16947,7 +18845,7 @@
             </w:pPr>
             <w:sdt>
               <w:sdtPr>
-                <w:id w:val="866076418"/>
+                <w:id w:val="-1632092351"/>
                 <w:tag w:val="goog_rdk_265"/>
               </w:sdtPr>
               <w:sdtContent>
@@ -16992,7 +18890,7 @@
             </w:pPr>
             <w:sdt>
               <w:sdtPr>
-                <w:id w:val="-164750587"/>
+                <w:id w:val="-1125000373"/>
                 <w:tag w:val="goog_rdk_266"/>
               </w:sdtPr>
               <w:sdtContent>
@@ -17037,7 +18935,7 @@
             </w:pPr>
             <w:sdt>
               <w:sdtPr>
-                <w:id w:val="-1945713926"/>
+                <w:id w:val="-1327173489"/>
                 <w:tag w:val="goog_rdk_267"/>
               </w:sdtPr>
               <w:sdtContent>
@@ -17088,7 +18986,7 @@
             </w:pPr>
             <w:sdt>
               <w:sdtPr>
-                <w:id w:val="1069590136"/>
+                <w:id w:val="-32026623"/>
                 <w:tag w:val="goog_rdk_268"/>
               </w:sdtPr>
               <w:sdtContent>
@@ -17133,7 +19031,7 @@
             </w:pPr>
             <w:sdt>
               <w:sdtPr>
-                <w:id w:val="1823719453"/>
+                <w:id w:val="-1997629027"/>
                 <w:tag w:val="goog_rdk_269"/>
               </w:sdtPr>
               <w:sdtContent>
@@ -17178,7 +19076,7 @@
             </w:pPr>
             <w:sdt>
               <w:sdtPr>
-                <w:id w:val="218349821"/>
+                <w:id w:val="133957614"/>
                 <w:tag w:val="goog_rdk_270"/>
               </w:sdtPr>
               <w:sdtContent>
@@ -17229,7 +19127,7 @@
             </w:pPr>
             <w:sdt>
               <w:sdtPr>
-                <w:id w:val="-1313927286"/>
+                <w:id w:val="1485576523"/>
                 <w:tag w:val="goog_rdk_271"/>
               </w:sdtPr>
               <w:sdtContent>
@@ -17274,7 +19172,7 @@
             </w:pPr>
             <w:sdt>
               <w:sdtPr>
-                <w:id w:val="-1338907197"/>
+                <w:id w:val="721692064"/>
                 <w:tag w:val="goog_rdk_272"/>
               </w:sdtPr>
               <w:sdtContent>
@@ -17319,7 +19217,7 @@
             </w:pPr>
             <w:sdt>
               <w:sdtPr>
-                <w:id w:val="1163511672"/>
+                <w:id w:val="-1353195761"/>
                 <w:tag w:val="goog_rdk_273"/>
               </w:sdtPr>
               <w:sdtContent>
@@ -17377,7 +19275,7 @@
       </w:pPr>
       <w:sdt>
         <w:sdtPr>
-          <w:id w:val="-1778525042"/>
+          <w:id w:val="-85460814"/>
           <w:tag w:val="goog_rdk_274"/>
         </w:sdtPr>
         <w:sdtContent>
@@ -17409,7 +19307,7 @@
       </w:pPr>
       <w:sdt>
         <w:sdtPr>
-          <w:id w:val="-1682918501"/>
+          <w:id w:val="1027847804"/>
           <w:tag w:val="goog_rdk_275"/>
         </w:sdtPr>
         <w:sdtContent>
@@ -17442,7 +19340,7 @@
       </w:pPr>
       <w:sdt>
         <w:sdtPr>
-          <w:id w:val="943052517"/>
+          <w:id w:val="329364910"/>
           <w:tag w:val="goog_rdk_276"/>
         </w:sdtPr>
         <w:sdtContent>
@@ -17624,7 +19522,7 @@
       </w:pPr>
       <w:sdt>
         <w:sdtPr>
-          <w:id w:val="-201986404"/>
+          <w:id w:val="1524342623"/>
           <w:tag w:val="goog_rdk_277"/>
         </w:sdtPr>
         <w:sdtContent>
@@ -17737,7 +19635,7 @@
       </w:pPr>
       <w:sdt>
         <w:sdtPr>
-          <w:id w:val="95809417"/>
+          <w:id w:val="1859553747"/>
           <w:tag w:val="goog_rdk_278"/>
         </w:sdtPr>
         <w:sdtContent>
@@ -17768,7 +19666,7 @@
       </w:pPr>
       <w:sdt>
         <w:sdtPr>
-          <w:id w:val="-1449746618"/>
+          <w:id w:val="-1114481902"/>
           <w:tag w:val="goog_rdk_279"/>
         </w:sdtPr>
         <w:sdtContent>
@@ -17799,7 +19697,7 @@
       </w:pPr>
       <w:sdt>
         <w:sdtPr>
-          <w:id w:val="-73814955"/>
+          <w:id w:val="36718765"/>
           <w:tag w:val="goog_rdk_280"/>
         </w:sdtPr>
         <w:sdtContent>
@@ -17830,7 +19728,7 @@
       </w:pPr>
       <w:sdt>
         <w:sdtPr>
-          <w:id w:val="-2046876591"/>
+          <w:id w:val="349736359"/>
           <w:tag w:val="goog_rdk_281"/>
         </w:sdtPr>
         <w:sdtContent>
@@ -17877,7 +19775,7 @@
     </w:pPr>
     <w:sdt>
       <w:sdtPr>
-        <w:id w:val="-143642546"/>
+        <w:id w:val="-580281986"/>
         <w:tag w:val="goog_rdk_283"/>
       </w:sdtPr>
       <w:sdtContent>
@@ -17947,7 +19845,7 @@
     </w:pPr>
     <w:sdt>
       <w:sdtPr>
-        <w:id w:val="-2005769403"/>
+        <w:id w:val="447560121"/>
         <w:tag w:val="goog_rdk_282"/>
       </w:sdtPr>
       <w:sdtContent>

</xml_diff>